<commit_message>
Fix Taschenbuch DOCXs: remove invalid lineRule to fix >828 pages KDP error
</commit_message>
<xml_diff>
--- a/outputs/buch-schuldgefuehle/das-schlechte-gewissen-Taschenbuch.docx
+++ b/outputs/buch-schuldgefuehle/das-schlechte-gewissen-Taschenbuch.docx
@@ -601,7 +601,7 @@
     </w:p>
     <w:p>
       <w:pPr>
-        <w:spacing w:after="120" w:before="0" w:line="276" w:lineRule="auto"/>
+        <w:spacing w:after="120" w:before="0"/>
         <w:jc w:val="both"/>
       </w:pPr>
       <w:r>
@@ -618,7 +618,7 @@
     </w:p>
     <w:p>
       <w:pPr>
-        <w:spacing w:after="120" w:before="0" w:line="276" w:lineRule="auto"/>
+        <w:spacing w:after="120" w:before="0"/>
         <w:jc w:val="both"/>
       </w:pPr>
       <w:r>
@@ -635,7 +635,7 @@
     </w:p>
     <w:p>
       <w:pPr>
-        <w:spacing w:after="120" w:before="0" w:line="276" w:lineRule="auto"/>
+        <w:spacing w:after="120" w:before="0"/>
         <w:jc w:val="both"/>
       </w:pPr>
       <w:r>
@@ -652,7 +652,7 @@
     </w:p>
     <w:p>
       <w:pPr>
-        <w:spacing w:after="120" w:before="0" w:line="276" w:lineRule="auto"/>
+        <w:spacing w:after="120" w:before="0"/>
         <w:jc w:val="both"/>
       </w:pPr>
       <w:r>
@@ -669,7 +669,7 @@
     </w:p>
     <w:p>
       <w:pPr>
-        <w:spacing w:after="120" w:before="0" w:line="276" w:lineRule="auto"/>
+        <w:spacing w:after="120" w:before="0"/>
         <w:jc w:val="both"/>
       </w:pPr>
       <w:r>
@@ -686,7 +686,7 @@
     </w:p>
     <w:p>
       <w:pPr>
-        <w:spacing w:after="120" w:before="0" w:line="276" w:lineRule="auto"/>
+        <w:spacing w:after="120" w:before="0"/>
         <w:jc w:val="both"/>
       </w:pPr>
       <w:r>
@@ -703,7 +703,7 @@
     </w:p>
     <w:p>
       <w:pPr>
-        <w:spacing w:after="120" w:before="0" w:line="276" w:lineRule="auto"/>
+        <w:spacing w:after="120" w:before="0"/>
         <w:jc w:val="both"/>
       </w:pPr>
       <w:r>
@@ -720,7 +720,7 @@
     </w:p>
     <w:p>
       <w:pPr>
-        <w:spacing w:after="120" w:before="0" w:line="276" w:lineRule="auto"/>
+        <w:spacing w:after="120" w:before="0"/>
         <w:jc w:val="both"/>
       </w:pPr>
       <w:r>
@@ -737,7 +737,7 @@
     </w:p>
     <w:p>
       <w:pPr>
-        <w:spacing w:after="120" w:before="0" w:line="276" w:lineRule="auto"/>
+        <w:spacing w:after="120" w:before="0"/>
         <w:jc w:val="both"/>
       </w:pPr>
       <w:r>
@@ -754,7 +754,7 @@
     </w:p>
     <w:p>
       <w:pPr>
-        <w:spacing w:after="120" w:before="0" w:line="276" w:lineRule="auto"/>
+        <w:spacing w:after="120" w:before="0"/>
         <w:jc w:val="both"/>
       </w:pPr>
       <w:r>
@@ -771,7 +771,7 @@
     </w:p>
     <w:p>
       <w:pPr>
-        <w:spacing w:after="120" w:before="0" w:line="276" w:lineRule="auto"/>
+        <w:spacing w:after="120" w:before="0"/>
         <w:jc w:val="both"/>
       </w:pPr>
       <w:r>
@@ -788,7 +788,7 @@
     </w:p>
     <w:p>
       <w:pPr>
-        <w:spacing w:after="120" w:before="0" w:line="276" w:lineRule="auto"/>
+        <w:spacing w:after="120" w:before="0"/>
         <w:jc w:val="both"/>
       </w:pPr>
       <w:r>
@@ -805,7 +805,7 @@
     </w:p>
     <w:p>
       <w:pPr>
-        <w:spacing w:after="120" w:before="0" w:line="276" w:lineRule="auto"/>
+        <w:spacing w:after="120" w:before="0"/>
         <w:jc w:val="both"/>
       </w:pPr>
       <w:r>
@@ -822,7 +822,7 @@
     </w:p>
     <w:p>
       <w:pPr>
-        <w:spacing w:after="120" w:before="0" w:line="276" w:lineRule="auto"/>
+        <w:spacing w:after="120" w:before="0"/>
         <w:jc w:val="both"/>
       </w:pPr>
       <w:r>
@@ -839,7 +839,7 @@
     </w:p>
     <w:p>
       <w:pPr>
-        <w:spacing w:after="120" w:before="0" w:line="276" w:lineRule="auto"/>
+        <w:spacing w:after="120" w:before="0"/>
         <w:jc w:val="both"/>
       </w:pPr>
       <w:r>
@@ -856,7 +856,7 @@
     </w:p>
     <w:p>
       <w:pPr>
-        <w:spacing w:after="120" w:before="0" w:line="276" w:lineRule="auto"/>
+        <w:spacing w:after="120" w:before="0"/>
         <w:jc w:val="both"/>
       </w:pPr>
       <w:r>
@@ -873,7 +873,7 @@
     </w:p>
     <w:p>
       <w:pPr>
-        <w:spacing w:after="120" w:before="0" w:line="276" w:lineRule="auto"/>
+        <w:spacing w:after="120" w:before="0"/>
         <w:jc w:val="both"/>
       </w:pPr>
       <w:r>
@@ -890,7 +890,7 @@
     </w:p>
     <w:p>
       <w:pPr>
-        <w:spacing w:after="120" w:before="0" w:line="276" w:lineRule="auto"/>
+        <w:spacing w:after="120" w:before="0"/>
         <w:jc w:val="both"/>
       </w:pPr>
       <w:r>
@@ -907,7 +907,7 @@
     </w:p>
     <w:p>
       <w:pPr>
-        <w:spacing w:after="120" w:before="0" w:line="276" w:lineRule="auto"/>
+        <w:spacing w:after="120" w:before="0"/>
         <w:jc w:val="both"/>
       </w:pPr>
       <w:r>
@@ -924,7 +924,7 @@
     </w:p>
     <w:p>
       <w:pPr>
-        <w:spacing w:after="120" w:before="0" w:line="276" w:lineRule="auto"/>
+        <w:spacing w:after="120" w:before="0"/>
         <w:jc w:val="both"/>
       </w:pPr>
       <w:r>
@@ -941,7 +941,7 @@
     </w:p>
     <w:p>
       <w:pPr>
-        <w:spacing w:after="120" w:before="0" w:line="276" w:lineRule="auto"/>
+        <w:spacing w:after="120" w:before="0"/>
         <w:jc w:val="both"/>
       </w:pPr>
       <w:r>
@@ -976,7 +976,7 @@
     </w:p>
     <w:p>
       <w:pPr>
-        <w:spacing w:after="120" w:before="0" w:line="276" w:lineRule="auto"/>
+        <w:spacing w:after="120" w:before="0"/>
         <w:jc w:val="both"/>
       </w:pPr>
       <w:r>
@@ -993,7 +993,7 @@
     </w:p>
     <w:p>
       <w:pPr>
-        <w:spacing w:after="120" w:before="0" w:line="276" w:lineRule="auto"/>
+        <w:spacing w:after="120" w:before="0"/>
         <w:jc w:val="both"/>
       </w:pPr>
       <w:r>
@@ -1010,7 +1010,7 @@
     </w:p>
     <w:p>
       <w:pPr>
-        <w:spacing w:after="120" w:before="0" w:line="276" w:lineRule="auto"/>
+        <w:spacing w:after="120" w:before="0"/>
         <w:jc w:val="both"/>
       </w:pPr>
       <w:r>
@@ -1027,7 +1027,7 @@
     </w:p>
     <w:p>
       <w:pPr>
-        <w:spacing w:after="120" w:before="0" w:line="276" w:lineRule="auto"/>
+        <w:spacing w:after="120" w:before="0"/>
         <w:jc w:val="both"/>
       </w:pPr>
       <w:r>
@@ -1044,7 +1044,7 @@
     </w:p>
     <w:p>
       <w:pPr>
-        <w:spacing w:after="120" w:before="0" w:line="276" w:lineRule="auto"/>
+        <w:spacing w:after="120" w:before="0"/>
         <w:jc w:val="both"/>
       </w:pPr>
       <w:r>
@@ -1061,7 +1061,7 @@
     </w:p>
     <w:p>
       <w:pPr>
-        <w:spacing w:after="120" w:before="0" w:line="276" w:lineRule="auto"/>
+        <w:spacing w:after="120" w:before="0"/>
         <w:jc w:val="both"/>
       </w:pPr>
       <w:r>
@@ -1078,7 +1078,7 @@
     </w:p>
     <w:p>
       <w:pPr>
-        <w:spacing w:after="120" w:before="0" w:line="276" w:lineRule="auto"/>
+        <w:spacing w:after="120" w:before="0"/>
         <w:jc w:val="both"/>
       </w:pPr>
       <w:r>
@@ -1095,7 +1095,7 @@
     </w:p>
     <w:p>
       <w:pPr>
-        <w:spacing w:after="120" w:before="0" w:line="276" w:lineRule="auto"/>
+        <w:spacing w:after="120" w:before="0"/>
         <w:jc w:val="both"/>
       </w:pPr>
       <w:r>
@@ -1112,7 +1112,7 @@
     </w:p>
     <w:p>
       <w:pPr>
-        <w:spacing w:after="120" w:before="0" w:line="276" w:lineRule="auto"/>
+        <w:spacing w:after="120" w:before="0"/>
         <w:jc w:val="both"/>
       </w:pPr>
       <w:r>
@@ -1129,7 +1129,7 @@
     </w:p>
     <w:p>
       <w:pPr>
-        <w:spacing w:after="120" w:before="0" w:line="276" w:lineRule="auto"/>
+        <w:spacing w:after="120" w:before="0"/>
         <w:jc w:val="both"/>
       </w:pPr>
       <w:r>
@@ -1146,7 +1146,7 @@
     </w:p>
     <w:p>
       <w:pPr>
-        <w:spacing w:after="120" w:before="0" w:line="276" w:lineRule="auto"/>
+        <w:spacing w:after="120" w:before="0"/>
         <w:jc w:val="both"/>
       </w:pPr>
       <w:r>
@@ -1163,7 +1163,7 @@
     </w:p>
     <w:p>
       <w:pPr>
-        <w:spacing w:after="120" w:before="0" w:line="276" w:lineRule="auto"/>
+        <w:spacing w:after="120" w:before="0"/>
         <w:jc w:val="both"/>
       </w:pPr>
       <w:r>
@@ -1180,7 +1180,7 @@
     </w:p>
     <w:p>
       <w:pPr>
-        <w:spacing w:after="120" w:before="0" w:line="276" w:lineRule="auto"/>
+        <w:spacing w:after="120" w:before="0"/>
         <w:jc w:val="both"/>
       </w:pPr>
       <w:r>
@@ -1197,7 +1197,7 @@
     </w:p>
     <w:p>
       <w:pPr>
-        <w:spacing w:after="120" w:before="0" w:line="276" w:lineRule="auto"/>
+        <w:spacing w:after="120" w:before="0"/>
         <w:jc w:val="both"/>
       </w:pPr>
       <w:r>
@@ -1214,7 +1214,7 @@
     </w:p>
     <w:p>
       <w:pPr>
-        <w:spacing w:after="120" w:before="0" w:line="276" w:lineRule="auto"/>
+        <w:spacing w:after="120" w:before="0"/>
         <w:jc w:val="both"/>
       </w:pPr>
       <w:r>
@@ -1231,7 +1231,7 @@
     </w:p>
     <w:p>
       <w:pPr>
-        <w:spacing w:after="120" w:before="0" w:line="276" w:lineRule="auto"/>
+        <w:spacing w:after="120" w:before="0"/>
         <w:jc w:val="both"/>
       </w:pPr>
       <w:r>
@@ -1248,7 +1248,7 @@
     </w:p>
     <w:p>
       <w:pPr>
-        <w:spacing w:after="120" w:before="0" w:line="276" w:lineRule="auto"/>
+        <w:spacing w:after="120" w:before="0"/>
         <w:jc w:val="both"/>
       </w:pPr>
       <w:r>
@@ -1265,7 +1265,7 @@
     </w:p>
     <w:p>
       <w:pPr>
-        <w:spacing w:after="120" w:before="0" w:line="276" w:lineRule="auto"/>
+        <w:spacing w:after="120" w:before="0"/>
         <w:jc w:val="both"/>
       </w:pPr>
       <w:r>
@@ -1282,7 +1282,7 @@
     </w:p>
     <w:p>
       <w:pPr>
-        <w:spacing w:after="120" w:before="0" w:line="276" w:lineRule="auto"/>
+        <w:spacing w:after="120" w:before="0"/>
         <w:jc w:val="both"/>
       </w:pPr>
       <w:r>
@@ -1299,7 +1299,7 @@
     </w:p>
     <w:p>
       <w:pPr>
-        <w:spacing w:after="120" w:before="0" w:line="276" w:lineRule="auto"/>
+        <w:spacing w:after="120" w:before="0"/>
         <w:jc w:val="both"/>
       </w:pPr>
       <w:r>
@@ -1316,7 +1316,7 @@
     </w:p>
     <w:p>
       <w:pPr>
-        <w:spacing w:after="120" w:before="0" w:line="276" w:lineRule="auto"/>
+        <w:spacing w:after="120" w:before="0"/>
         <w:jc w:val="both"/>
       </w:pPr>
       <w:r>
@@ -1333,7 +1333,7 @@
     </w:p>
     <w:p>
       <w:pPr>
-        <w:spacing w:after="120" w:before="0" w:line="276" w:lineRule="auto"/>
+        <w:spacing w:after="120" w:before="0"/>
         <w:jc w:val="both"/>
       </w:pPr>
       <w:r>
@@ -1350,7 +1350,7 @@
     </w:p>
     <w:p>
       <w:pPr>
-        <w:spacing w:after="120" w:before="0" w:line="276" w:lineRule="auto"/>
+        <w:spacing w:after="120" w:before="0"/>
         <w:jc w:val="both"/>
       </w:pPr>
       <w:r>
@@ -1367,7 +1367,7 @@
     </w:p>
     <w:p>
       <w:pPr>
-        <w:spacing w:after="120" w:before="0" w:line="276" w:lineRule="auto"/>
+        <w:spacing w:after="120" w:before="0"/>
         <w:jc w:val="both"/>
       </w:pPr>
       <w:r>
@@ -1402,7 +1402,7 @@
     </w:p>
     <w:p>
       <w:pPr>
-        <w:spacing w:after="120" w:before="0" w:line="276" w:lineRule="auto"/>
+        <w:spacing w:after="120" w:before="0"/>
         <w:jc w:val="both"/>
       </w:pPr>
       <w:r>
@@ -1419,7 +1419,7 @@
     </w:p>
     <w:p>
       <w:pPr>
-        <w:spacing w:after="120" w:before="0" w:line="276" w:lineRule="auto"/>
+        <w:spacing w:after="120" w:before="0"/>
         <w:jc w:val="both"/>
       </w:pPr>
       <w:r>
@@ -1436,7 +1436,7 @@
     </w:p>
     <w:p>
       <w:pPr>
-        <w:spacing w:after="120" w:before="0" w:line="276" w:lineRule="auto"/>
+        <w:spacing w:after="120" w:before="0"/>
         <w:jc w:val="both"/>
       </w:pPr>
       <w:r>
@@ -1453,7 +1453,7 @@
     </w:p>
     <w:p>
       <w:pPr>
-        <w:spacing w:after="120" w:before="0" w:line="276" w:lineRule="auto"/>
+        <w:spacing w:after="120" w:before="0"/>
         <w:jc w:val="both"/>
       </w:pPr>
       <w:r>
@@ -1470,7 +1470,7 @@
     </w:p>
     <w:p>
       <w:pPr>
-        <w:spacing w:after="120" w:before="0" w:line="276" w:lineRule="auto"/>
+        <w:spacing w:after="120" w:before="0"/>
         <w:jc w:val="both"/>
       </w:pPr>
       <w:r>
@@ -1487,7 +1487,7 @@
     </w:p>
     <w:p>
       <w:pPr>
-        <w:spacing w:after="120" w:before="0" w:line="276" w:lineRule="auto"/>
+        <w:spacing w:after="120" w:before="0"/>
         <w:jc w:val="both"/>
       </w:pPr>
       <w:r>
@@ -1504,7 +1504,7 @@
     </w:p>
     <w:p>
       <w:pPr>
-        <w:spacing w:after="120" w:before="0" w:line="276" w:lineRule="auto"/>
+        <w:spacing w:after="120" w:before="0"/>
         <w:jc w:val="both"/>
       </w:pPr>
       <w:r>
@@ -1521,7 +1521,7 @@
     </w:p>
     <w:p>
       <w:pPr>
-        <w:spacing w:after="120" w:before="0" w:line="276" w:lineRule="auto"/>
+        <w:spacing w:after="120" w:before="0"/>
         <w:jc w:val="both"/>
       </w:pPr>
       <w:r>
@@ -1538,7 +1538,7 @@
     </w:p>
     <w:p>
       <w:pPr>
-        <w:spacing w:after="120" w:before="0" w:line="276" w:lineRule="auto"/>
+        <w:spacing w:after="120" w:before="0"/>
         <w:jc w:val="both"/>
       </w:pPr>
       <w:r>
@@ -1555,7 +1555,7 @@
     </w:p>
     <w:p>
       <w:pPr>
-        <w:spacing w:after="120" w:before="0" w:line="276" w:lineRule="auto"/>
+        <w:spacing w:after="120" w:before="0"/>
         <w:jc w:val="both"/>
       </w:pPr>
       <w:r>
@@ -1572,7 +1572,7 @@
     </w:p>
     <w:p>
       <w:pPr>
-        <w:spacing w:after="120" w:before="0" w:line="276" w:lineRule="auto"/>
+        <w:spacing w:after="120" w:before="0"/>
         <w:jc w:val="both"/>
       </w:pPr>
       <w:r>
@@ -1589,7 +1589,7 @@
     </w:p>
     <w:p>
       <w:pPr>
-        <w:spacing w:after="120" w:before="0" w:line="276" w:lineRule="auto"/>
+        <w:spacing w:after="120" w:before="0"/>
         <w:jc w:val="both"/>
       </w:pPr>
       <w:r>
@@ -1606,7 +1606,7 @@
     </w:p>
     <w:p>
       <w:pPr>
-        <w:spacing w:after="120" w:before="0" w:line="276" w:lineRule="auto"/>
+        <w:spacing w:after="120" w:before="0"/>
         <w:jc w:val="both"/>
       </w:pPr>
       <w:r>
@@ -1623,7 +1623,7 @@
     </w:p>
     <w:p>
       <w:pPr>
-        <w:spacing w:after="120" w:before="0" w:line="276" w:lineRule="auto"/>
+        <w:spacing w:after="120" w:before="0"/>
         <w:jc w:val="both"/>
       </w:pPr>
       <w:r>
@@ -1640,7 +1640,7 @@
     </w:p>
     <w:p>
       <w:pPr>
-        <w:spacing w:after="120" w:before="0" w:line="276" w:lineRule="auto"/>
+        <w:spacing w:after="120" w:before="0"/>
         <w:jc w:val="both"/>
       </w:pPr>
       <w:r>
@@ -1657,7 +1657,7 @@
     </w:p>
     <w:p>
       <w:pPr>
-        <w:spacing w:after="120" w:before="0" w:line="276" w:lineRule="auto"/>
+        <w:spacing w:after="120" w:before="0"/>
         <w:jc w:val="both"/>
       </w:pPr>
       <w:r>
@@ -1674,7 +1674,7 @@
     </w:p>
     <w:p>
       <w:pPr>
-        <w:spacing w:after="120" w:before="0" w:line="276" w:lineRule="auto"/>
+        <w:spacing w:after="120" w:before="0"/>
         <w:jc w:val="both"/>
       </w:pPr>
       <w:r>
@@ -1691,7 +1691,7 @@
     </w:p>
     <w:p>
       <w:pPr>
-        <w:spacing w:after="120" w:before="0" w:line="276" w:lineRule="auto"/>
+        <w:spacing w:after="120" w:before="0"/>
         <w:jc w:val="both"/>
       </w:pPr>
       <w:r>
@@ -1708,7 +1708,7 @@
     </w:p>
     <w:p>
       <w:pPr>
-        <w:spacing w:after="120" w:before="0" w:line="276" w:lineRule="auto"/>
+        <w:spacing w:after="120" w:before="0"/>
         <w:jc w:val="both"/>
       </w:pPr>
       <w:r>
@@ -1725,7 +1725,7 @@
     </w:p>
     <w:p>
       <w:pPr>
-        <w:spacing w:after="120" w:before="0" w:line="276" w:lineRule="auto"/>
+        <w:spacing w:after="120" w:before="0"/>
         <w:jc w:val="both"/>
       </w:pPr>
       <w:r>
@@ -1742,7 +1742,7 @@
     </w:p>
     <w:p>
       <w:pPr>
-        <w:spacing w:after="120" w:before="0" w:line="276" w:lineRule="auto"/>
+        <w:spacing w:after="120" w:before="0"/>
         <w:jc w:val="both"/>
       </w:pPr>
       <w:r>
@@ -1759,7 +1759,7 @@
     </w:p>
     <w:p>
       <w:pPr>
-        <w:spacing w:after="120" w:before="0" w:line="276" w:lineRule="auto"/>
+        <w:spacing w:after="120" w:before="0"/>
         <w:jc w:val="both"/>
       </w:pPr>
       <w:r>
@@ -1776,7 +1776,7 @@
     </w:p>
     <w:p>
       <w:pPr>
-        <w:spacing w:after="120" w:before="0" w:line="276" w:lineRule="auto"/>
+        <w:spacing w:after="120" w:before="0"/>
         <w:jc w:val="both"/>
       </w:pPr>
       <w:r>
@@ -1793,7 +1793,7 @@
     </w:p>
     <w:p>
       <w:pPr>
-        <w:spacing w:after="120" w:before="0" w:line="276" w:lineRule="auto"/>
+        <w:spacing w:after="120" w:before="0"/>
         <w:jc w:val="both"/>
       </w:pPr>
       <w:r>
@@ -1810,7 +1810,7 @@
     </w:p>
     <w:p>
       <w:pPr>
-        <w:spacing w:after="120" w:before="0" w:line="276" w:lineRule="auto"/>
+        <w:spacing w:after="120" w:before="0"/>
         <w:jc w:val="both"/>
       </w:pPr>
       <w:r>
@@ -1827,7 +1827,7 @@
     </w:p>
     <w:p>
       <w:pPr>
-        <w:spacing w:after="120" w:before="0" w:line="276" w:lineRule="auto"/>
+        <w:spacing w:after="120" w:before="0"/>
         <w:jc w:val="both"/>
       </w:pPr>
       <w:r>
@@ -1862,7 +1862,7 @@
     </w:p>
     <w:p>
       <w:pPr>
-        <w:spacing w:after="120" w:before="0" w:line="276" w:lineRule="auto"/>
+        <w:spacing w:after="120" w:before="0"/>
         <w:jc w:val="both"/>
       </w:pPr>
       <w:r>
@@ -1879,7 +1879,7 @@
     </w:p>
     <w:p>
       <w:pPr>
-        <w:spacing w:after="120" w:before="0" w:line="276" w:lineRule="auto"/>
+        <w:spacing w:after="120" w:before="0"/>
         <w:jc w:val="both"/>
       </w:pPr>
       <w:r>
@@ -1896,7 +1896,7 @@
     </w:p>
     <w:p>
       <w:pPr>
-        <w:spacing w:after="120" w:before="0" w:line="276" w:lineRule="auto"/>
+        <w:spacing w:after="120" w:before="0"/>
         <w:jc w:val="both"/>
       </w:pPr>
       <w:r>
@@ -1913,7 +1913,7 @@
     </w:p>
     <w:p>
       <w:pPr>
-        <w:spacing w:after="120" w:before="0" w:line="276" w:lineRule="auto"/>
+        <w:spacing w:after="120" w:before="0"/>
         <w:jc w:val="both"/>
       </w:pPr>
       <w:r>
@@ -1930,7 +1930,7 @@
     </w:p>
     <w:p>
       <w:pPr>
-        <w:spacing w:after="120" w:before="0" w:line="276" w:lineRule="auto"/>
+        <w:spacing w:after="120" w:before="0"/>
         <w:jc w:val="both"/>
       </w:pPr>
       <w:r>
@@ -1947,7 +1947,7 @@
     </w:p>
     <w:p>
       <w:pPr>
-        <w:spacing w:after="120" w:before="0" w:line="276" w:lineRule="auto"/>
+        <w:spacing w:after="120" w:before="0"/>
         <w:jc w:val="both"/>
       </w:pPr>
       <w:r>
@@ -1964,7 +1964,7 @@
     </w:p>
     <w:p>
       <w:pPr>
-        <w:spacing w:after="120" w:before="0" w:line="276" w:lineRule="auto"/>
+        <w:spacing w:after="120" w:before="0"/>
         <w:jc w:val="both"/>
       </w:pPr>
       <w:r>
@@ -1981,7 +1981,7 @@
     </w:p>
     <w:p>
       <w:pPr>
-        <w:spacing w:after="120" w:before="0" w:line="276" w:lineRule="auto"/>
+        <w:spacing w:after="120" w:before="0"/>
         <w:jc w:val="both"/>
       </w:pPr>
       <w:r>
@@ -1998,7 +1998,7 @@
     </w:p>
     <w:p>
       <w:pPr>
-        <w:spacing w:after="120" w:before="0" w:line="276" w:lineRule="auto"/>
+        <w:spacing w:after="120" w:before="0"/>
         <w:jc w:val="both"/>
       </w:pPr>
       <w:r>
@@ -2015,7 +2015,7 @@
     </w:p>
     <w:p>
       <w:pPr>
-        <w:spacing w:after="120" w:before="0" w:line="276" w:lineRule="auto"/>
+        <w:spacing w:after="120" w:before="0"/>
         <w:jc w:val="both"/>
       </w:pPr>
       <w:r>
@@ -2032,7 +2032,7 @@
     </w:p>
     <w:p>
       <w:pPr>
-        <w:spacing w:after="120" w:before="0" w:line="276" w:lineRule="auto"/>
+        <w:spacing w:after="120" w:before="0"/>
         <w:jc w:val="both"/>
       </w:pPr>
       <w:r>
@@ -2049,7 +2049,7 @@
     </w:p>
     <w:p>
       <w:pPr>
-        <w:spacing w:after="120" w:before="0" w:line="276" w:lineRule="auto"/>
+        <w:spacing w:after="120" w:before="0"/>
         <w:jc w:val="both"/>
       </w:pPr>
       <w:r>
@@ -2066,7 +2066,7 @@
     </w:p>
     <w:p>
       <w:pPr>
-        <w:spacing w:after="120" w:before="0" w:line="276" w:lineRule="auto"/>
+        <w:spacing w:after="120" w:before="0"/>
         <w:jc w:val="both"/>
       </w:pPr>
       <w:r>
@@ -2083,7 +2083,7 @@
     </w:p>
     <w:p>
       <w:pPr>
-        <w:spacing w:after="120" w:before="0" w:line="276" w:lineRule="auto"/>
+        <w:spacing w:after="120" w:before="0"/>
         <w:jc w:val="both"/>
       </w:pPr>
       <w:r>
@@ -2100,7 +2100,7 @@
     </w:p>
     <w:p>
       <w:pPr>
-        <w:spacing w:after="120" w:before="0" w:line="276" w:lineRule="auto"/>
+        <w:spacing w:after="120" w:before="0"/>
         <w:jc w:val="both"/>
       </w:pPr>
       <w:r>
@@ -2117,7 +2117,7 @@
     </w:p>
     <w:p>
       <w:pPr>
-        <w:spacing w:after="120" w:before="0" w:line="276" w:lineRule="auto"/>
+        <w:spacing w:after="120" w:before="0"/>
         <w:jc w:val="both"/>
       </w:pPr>
       <w:r>
@@ -2134,7 +2134,7 @@
     </w:p>
     <w:p>
       <w:pPr>
-        <w:spacing w:after="120" w:before="0" w:line="276" w:lineRule="auto"/>
+        <w:spacing w:after="120" w:before="0"/>
         <w:jc w:val="both"/>
       </w:pPr>
       <w:r>
@@ -2151,7 +2151,7 @@
     </w:p>
     <w:p>
       <w:pPr>
-        <w:spacing w:after="120" w:before="0" w:line="276" w:lineRule="auto"/>
+        <w:spacing w:after="120" w:before="0"/>
         <w:jc w:val="both"/>
       </w:pPr>
       <w:r>
@@ -2168,7 +2168,7 @@
     </w:p>
     <w:p>
       <w:pPr>
-        <w:spacing w:after="120" w:before="0" w:line="276" w:lineRule="auto"/>
+        <w:spacing w:after="120" w:before="0"/>
         <w:jc w:val="both"/>
       </w:pPr>
       <w:r>
@@ -2185,7 +2185,7 @@
     </w:p>
     <w:p>
       <w:pPr>
-        <w:spacing w:after="120" w:before="0" w:line="276" w:lineRule="auto"/>
+        <w:spacing w:after="120" w:before="0"/>
         <w:jc w:val="both"/>
       </w:pPr>
       <w:r>
@@ -2202,7 +2202,7 @@
     </w:p>
     <w:p>
       <w:pPr>
-        <w:spacing w:after="120" w:before="0" w:line="276" w:lineRule="auto"/>
+        <w:spacing w:after="120" w:before="0"/>
         <w:jc w:val="both"/>
       </w:pPr>
       <w:r>
@@ -2219,7 +2219,7 @@
     </w:p>
     <w:p>
       <w:pPr>
-        <w:spacing w:after="120" w:before="0" w:line="276" w:lineRule="auto"/>
+        <w:spacing w:after="120" w:before="0"/>
         <w:jc w:val="both"/>
       </w:pPr>
       <w:r>
@@ -2236,7 +2236,7 @@
     </w:p>
     <w:p>
       <w:pPr>
-        <w:spacing w:after="120" w:before="0" w:line="276" w:lineRule="auto"/>
+        <w:spacing w:after="120" w:before="0"/>
         <w:jc w:val="both"/>
       </w:pPr>
       <w:r>
@@ -2253,7 +2253,7 @@
     </w:p>
     <w:p>
       <w:pPr>
-        <w:spacing w:after="120" w:before="0" w:line="276" w:lineRule="auto"/>
+        <w:spacing w:after="120" w:before="0"/>
         <w:jc w:val="both"/>
       </w:pPr>
       <w:r>
@@ -2270,7 +2270,7 @@
     </w:p>
     <w:p>
       <w:pPr>
-        <w:spacing w:after="120" w:before="0" w:line="276" w:lineRule="auto"/>
+        <w:spacing w:after="120" w:before="0"/>
         <w:jc w:val="both"/>
       </w:pPr>
       <w:r>
@@ -2305,7 +2305,7 @@
     </w:p>
     <w:p>
       <w:pPr>
-        <w:spacing w:after="120" w:before="0" w:line="276" w:lineRule="auto"/>
+        <w:spacing w:after="120" w:before="0"/>
         <w:jc w:val="both"/>
       </w:pPr>
       <w:r>
@@ -2322,7 +2322,7 @@
     </w:p>
     <w:p>
       <w:pPr>
-        <w:spacing w:after="120" w:before="0" w:line="276" w:lineRule="auto"/>
+        <w:spacing w:after="120" w:before="0"/>
         <w:jc w:val="both"/>
       </w:pPr>
       <w:r>
@@ -2339,7 +2339,7 @@
     </w:p>
     <w:p>
       <w:pPr>
-        <w:spacing w:after="120" w:before="0" w:line="276" w:lineRule="auto"/>
+        <w:spacing w:after="120" w:before="0"/>
         <w:jc w:val="both"/>
       </w:pPr>
       <w:r>
@@ -2356,7 +2356,7 @@
     </w:p>
     <w:p>
       <w:pPr>
-        <w:spacing w:after="120" w:before="0" w:line="276" w:lineRule="auto"/>
+        <w:spacing w:after="120" w:before="0"/>
         <w:jc w:val="both"/>
       </w:pPr>
       <w:r>
@@ -2373,7 +2373,7 @@
     </w:p>
     <w:p>
       <w:pPr>
-        <w:spacing w:after="120" w:before="0" w:line="276" w:lineRule="auto"/>
+        <w:spacing w:after="120" w:before="0"/>
         <w:jc w:val="both"/>
       </w:pPr>
       <w:r>
@@ -2390,7 +2390,7 @@
     </w:p>
     <w:p>
       <w:pPr>
-        <w:spacing w:after="120" w:before="0" w:line="276" w:lineRule="auto"/>
+        <w:spacing w:after="120" w:before="0"/>
         <w:jc w:val="both"/>
       </w:pPr>
       <w:r>
@@ -2407,7 +2407,7 @@
     </w:p>
     <w:p>
       <w:pPr>
-        <w:spacing w:after="120" w:before="0" w:line="276" w:lineRule="auto"/>
+        <w:spacing w:after="120" w:before="0"/>
         <w:jc w:val="both"/>
       </w:pPr>
       <w:r>
@@ -2424,7 +2424,7 @@
     </w:p>
     <w:p>
       <w:pPr>
-        <w:spacing w:after="120" w:before="0" w:line="276" w:lineRule="auto"/>
+        <w:spacing w:after="120" w:before="0"/>
         <w:jc w:val="both"/>
       </w:pPr>
       <w:r>
@@ -2441,7 +2441,7 @@
     </w:p>
     <w:p>
       <w:pPr>
-        <w:spacing w:after="120" w:before="0" w:line="276" w:lineRule="auto"/>
+        <w:spacing w:after="120" w:before="0"/>
         <w:jc w:val="both"/>
       </w:pPr>
       <w:r>
@@ -2458,7 +2458,7 @@
     </w:p>
     <w:p>
       <w:pPr>
-        <w:spacing w:after="120" w:before="0" w:line="276" w:lineRule="auto"/>
+        <w:spacing w:after="120" w:before="0"/>
         <w:jc w:val="both"/>
       </w:pPr>
       <w:r>
@@ -2475,7 +2475,7 @@
     </w:p>
     <w:p>
       <w:pPr>
-        <w:spacing w:after="120" w:before="0" w:line="276" w:lineRule="auto"/>
+        <w:spacing w:after="120" w:before="0"/>
         <w:jc w:val="both"/>
       </w:pPr>
       <w:r>
@@ -2492,7 +2492,7 @@
     </w:p>
     <w:p>
       <w:pPr>
-        <w:spacing w:after="120" w:before="0" w:line="276" w:lineRule="auto"/>
+        <w:spacing w:after="120" w:before="0"/>
         <w:jc w:val="both"/>
       </w:pPr>
       <w:r>
@@ -2509,7 +2509,7 @@
     </w:p>
     <w:p>
       <w:pPr>
-        <w:spacing w:after="120" w:before="0" w:line="276" w:lineRule="auto"/>
+        <w:spacing w:after="120" w:before="0"/>
         <w:jc w:val="both"/>
       </w:pPr>
       <w:r>
@@ -2526,7 +2526,7 @@
     </w:p>
     <w:p>
       <w:pPr>
-        <w:spacing w:after="120" w:before="0" w:line="276" w:lineRule="auto"/>
+        <w:spacing w:after="120" w:before="0"/>
         <w:jc w:val="both"/>
       </w:pPr>
       <w:r>
@@ -2543,7 +2543,7 @@
     </w:p>
     <w:p>
       <w:pPr>
-        <w:spacing w:after="120" w:before="0" w:line="276" w:lineRule="auto"/>
+        <w:spacing w:after="120" w:before="0"/>
         <w:jc w:val="both"/>
       </w:pPr>
       <w:r>
@@ -2560,7 +2560,7 @@
     </w:p>
     <w:p>
       <w:pPr>
-        <w:spacing w:after="120" w:before="0" w:line="276" w:lineRule="auto"/>
+        <w:spacing w:after="120" w:before="0"/>
         <w:jc w:val="both"/>
       </w:pPr>
       <w:r>
@@ -2577,7 +2577,7 @@
     </w:p>
     <w:p>
       <w:pPr>
-        <w:spacing w:after="120" w:before="0" w:line="276" w:lineRule="auto"/>
+        <w:spacing w:after="120" w:before="0"/>
         <w:jc w:val="both"/>
       </w:pPr>
       <w:r>
@@ -2594,7 +2594,7 @@
     </w:p>
     <w:p>
       <w:pPr>
-        <w:spacing w:after="120" w:before="0" w:line="276" w:lineRule="auto"/>
+        <w:spacing w:after="120" w:before="0"/>
         <w:jc w:val="both"/>
       </w:pPr>
       <w:r>
@@ -2611,7 +2611,7 @@
     </w:p>
     <w:p>
       <w:pPr>
-        <w:spacing w:after="120" w:before="0" w:line="276" w:lineRule="auto"/>
+        <w:spacing w:after="120" w:before="0"/>
         <w:jc w:val="both"/>
       </w:pPr>
       <w:r>
@@ -2628,7 +2628,7 @@
     </w:p>
     <w:p>
       <w:pPr>
-        <w:spacing w:after="120" w:before="0" w:line="276" w:lineRule="auto"/>
+        <w:spacing w:after="120" w:before="0"/>
         <w:jc w:val="both"/>
       </w:pPr>
       <w:r>
@@ -2645,7 +2645,7 @@
     </w:p>
     <w:p>
       <w:pPr>
-        <w:spacing w:after="120" w:before="0" w:line="276" w:lineRule="auto"/>
+        <w:spacing w:after="120" w:before="0"/>
         <w:jc w:val="both"/>
       </w:pPr>
       <w:r>
@@ -2662,7 +2662,7 @@
     </w:p>
     <w:p>
       <w:pPr>
-        <w:spacing w:after="120" w:before="0" w:line="276" w:lineRule="auto"/>
+        <w:spacing w:after="120" w:before="0"/>
         <w:jc w:val="both"/>
       </w:pPr>
       <w:r>
@@ -2679,7 +2679,7 @@
     </w:p>
     <w:p>
       <w:pPr>
-        <w:spacing w:after="120" w:before="0" w:line="276" w:lineRule="auto"/>
+        <w:spacing w:after="120" w:before="0"/>
         <w:jc w:val="both"/>
       </w:pPr>
       <w:r>
@@ -2696,7 +2696,7 @@
     </w:p>
     <w:p>
       <w:pPr>
-        <w:spacing w:after="120" w:before="0" w:line="276" w:lineRule="auto"/>
+        <w:spacing w:after="120" w:before="0"/>
         <w:jc w:val="both"/>
       </w:pPr>
       <w:r>
@@ -2713,7 +2713,7 @@
     </w:p>
     <w:p>
       <w:pPr>
-        <w:spacing w:after="120" w:before="0" w:line="276" w:lineRule="auto"/>
+        <w:spacing w:after="120" w:before="0"/>
         <w:jc w:val="both"/>
       </w:pPr>
       <w:r>
@@ -2748,7 +2748,7 @@
     </w:p>
     <w:p>
       <w:pPr>
-        <w:spacing w:after="120" w:before="0" w:line="276" w:lineRule="auto"/>
+        <w:spacing w:after="120" w:before="0"/>
         <w:jc w:val="both"/>
       </w:pPr>
       <w:r>
@@ -2765,7 +2765,7 @@
     </w:p>
     <w:p>
       <w:pPr>
-        <w:spacing w:after="120" w:before="0" w:line="276" w:lineRule="auto"/>
+        <w:spacing w:after="120" w:before="0"/>
         <w:jc w:val="both"/>
       </w:pPr>
       <w:r>
@@ -2782,7 +2782,7 @@
     </w:p>
     <w:p>
       <w:pPr>
-        <w:spacing w:after="120" w:before="0" w:line="276" w:lineRule="auto"/>
+        <w:spacing w:after="120" w:before="0"/>
         <w:jc w:val="both"/>
       </w:pPr>
       <w:r>
@@ -2799,7 +2799,7 @@
     </w:p>
     <w:p>
       <w:pPr>
-        <w:spacing w:after="120" w:before="0" w:line="276" w:lineRule="auto"/>
+        <w:spacing w:after="120" w:before="0"/>
         <w:jc w:val="both"/>
       </w:pPr>
       <w:r>
@@ -2816,7 +2816,7 @@
     </w:p>
     <w:p>
       <w:pPr>
-        <w:spacing w:after="120" w:before="0" w:line="276" w:lineRule="auto"/>
+        <w:spacing w:after="120" w:before="0"/>
         <w:jc w:val="both"/>
       </w:pPr>
       <w:r>
@@ -2833,7 +2833,7 @@
     </w:p>
     <w:p>
       <w:pPr>
-        <w:spacing w:after="120" w:before="0" w:line="276" w:lineRule="auto"/>
+        <w:spacing w:after="120" w:before="0"/>
         <w:jc w:val="both"/>
       </w:pPr>
       <w:r>
@@ -2850,7 +2850,7 @@
     </w:p>
     <w:p>
       <w:pPr>
-        <w:spacing w:after="120" w:before="0" w:line="276" w:lineRule="auto"/>
+        <w:spacing w:after="120" w:before="0"/>
         <w:jc w:val="both"/>
       </w:pPr>
       <w:r>
@@ -2867,7 +2867,7 @@
     </w:p>
     <w:p>
       <w:pPr>
-        <w:spacing w:after="120" w:before="0" w:line="276" w:lineRule="auto"/>
+        <w:spacing w:after="120" w:before="0"/>
         <w:jc w:val="both"/>
       </w:pPr>
       <w:r>
@@ -2884,7 +2884,7 @@
     </w:p>
     <w:p>
       <w:pPr>
-        <w:spacing w:after="120" w:before="0" w:line="276" w:lineRule="auto"/>
+        <w:spacing w:after="120" w:before="0"/>
         <w:jc w:val="both"/>
       </w:pPr>
       <w:r>
@@ -2901,7 +2901,7 @@
     </w:p>
     <w:p>
       <w:pPr>
-        <w:spacing w:after="120" w:before="0" w:line="276" w:lineRule="auto"/>
+        <w:spacing w:after="120" w:before="0"/>
         <w:jc w:val="both"/>
       </w:pPr>
       <w:r>
@@ -2918,7 +2918,7 @@
     </w:p>
     <w:p>
       <w:pPr>
-        <w:spacing w:after="120" w:before="0" w:line="276" w:lineRule="auto"/>
+        <w:spacing w:after="120" w:before="0"/>
         <w:jc w:val="both"/>
       </w:pPr>
       <w:r>
@@ -2935,7 +2935,7 @@
     </w:p>
     <w:p>
       <w:pPr>
-        <w:spacing w:after="120" w:before="0" w:line="276" w:lineRule="auto"/>
+        <w:spacing w:after="120" w:before="0"/>
         <w:jc w:val="both"/>
       </w:pPr>
       <w:r>
@@ -2952,7 +2952,7 @@
     </w:p>
     <w:p>
       <w:pPr>
-        <w:spacing w:after="120" w:before="0" w:line="276" w:lineRule="auto"/>
+        <w:spacing w:after="120" w:before="0"/>
         <w:jc w:val="both"/>
       </w:pPr>
       <w:r>
@@ -2969,7 +2969,7 @@
     </w:p>
     <w:p>
       <w:pPr>
-        <w:spacing w:after="120" w:before="0" w:line="276" w:lineRule="auto"/>
+        <w:spacing w:after="120" w:before="0"/>
         <w:jc w:val="both"/>
       </w:pPr>
       <w:r>
@@ -2986,7 +2986,7 @@
     </w:p>
     <w:p>
       <w:pPr>
-        <w:spacing w:after="120" w:before="0" w:line="276" w:lineRule="auto"/>
+        <w:spacing w:after="120" w:before="0"/>
         <w:jc w:val="both"/>
       </w:pPr>
       <w:r>
@@ -3003,7 +3003,7 @@
     </w:p>
     <w:p>
       <w:pPr>
-        <w:spacing w:after="120" w:before="0" w:line="276" w:lineRule="auto"/>
+        <w:spacing w:after="120" w:before="0"/>
         <w:jc w:val="both"/>
       </w:pPr>
       <w:r>
@@ -3020,7 +3020,7 @@
     </w:p>
     <w:p>
       <w:pPr>
-        <w:spacing w:after="120" w:before="0" w:line="276" w:lineRule="auto"/>
+        <w:spacing w:after="120" w:before="0"/>
         <w:jc w:val="both"/>
       </w:pPr>
       <w:r>
@@ -3037,7 +3037,7 @@
     </w:p>
     <w:p>
       <w:pPr>
-        <w:spacing w:after="120" w:before="0" w:line="276" w:lineRule="auto"/>
+        <w:spacing w:after="120" w:before="0"/>
         <w:jc w:val="both"/>
       </w:pPr>
       <w:r>
@@ -3054,7 +3054,7 @@
     </w:p>
     <w:p>
       <w:pPr>
-        <w:spacing w:after="120" w:before="0" w:line="276" w:lineRule="auto"/>
+        <w:spacing w:after="120" w:before="0"/>
         <w:jc w:val="both"/>
       </w:pPr>
       <w:r>
@@ -3071,7 +3071,7 @@
     </w:p>
     <w:p>
       <w:pPr>
-        <w:spacing w:after="120" w:before="0" w:line="276" w:lineRule="auto"/>
+        <w:spacing w:after="120" w:before="0"/>
         <w:jc w:val="both"/>
       </w:pPr>
       <w:r>
@@ -3088,7 +3088,7 @@
     </w:p>
     <w:p>
       <w:pPr>
-        <w:spacing w:after="120" w:before="0" w:line="276" w:lineRule="auto"/>
+        <w:spacing w:after="120" w:before="0"/>
         <w:jc w:val="both"/>
       </w:pPr>
       <w:r>
@@ -3123,7 +3123,7 @@
     </w:p>
     <w:p>
       <w:pPr>
-        <w:spacing w:after="120" w:before="0" w:line="276" w:lineRule="auto"/>
+        <w:spacing w:after="120" w:before="0"/>
         <w:jc w:val="both"/>
       </w:pPr>
       <w:r>
@@ -3140,7 +3140,7 @@
     </w:p>
     <w:p>
       <w:pPr>
-        <w:spacing w:after="120" w:before="0" w:line="276" w:lineRule="auto"/>
+        <w:spacing w:after="120" w:before="0"/>
         <w:jc w:val="both"/>
       </w:pPr>
       <w:r>
@@ -3157,7 +3157,7 @@
     </w:p>
     <w:p>
       <w:pPr>
-        <w:spacing w:after="120" w:before="0" w:line="276" w:lineRule="auto"/>
+        <w:spacing w:after="120" w:before="0"/>
         <w:jc w:val="both"/>
       </w:pPr>
       <w:r>
@@ -3174,7 +3174,7 @@
     </w:p>
     <w:p>
       <w:pPr>
-        <w:spacing w:after="120" w:before="0" w:line="276" w:lineRule="auto"/>
+        <w:spacing w:after="120" w:before="0"/>
         <w:jc w:val="both"/>
       </w:pPr>
       <w:r>
@@ -3191,7 +3191,7 @@
     </w:p>
     <w:p>
       <w:pPr>
-        <w:spacing w:after="120" w:before="0" w:line="276" w:lineRule="auto"/>
+        <w:spacing w:after="120" w:before="0"/>
         <w:jc w:val="both"/>
       </w:pPr>
       <w:r>
@@ -3208,7 +3208,7 @@
     </w:p>
     <w:p>
       <w:pPr>
-        <w:spacing w:after="120" w:before="0" w:line="276" w:lineRule="auto"/>
+        <w:spacing w:after="120" w:before="0"/>
         <w:jc w:val="both"/>
       </w:pPr>
       <w:r>
@@ -3225,7 +3225,7 @@
     </w:p>
     <w:p>
       <w:pPr>
-        <w:spacing w:after="120" w:before="0" w:line="276" w:lineRule="auto"/>
+        <w:spacing w:after="120" w:before="0"/>
         <w:jc w:val="both"/>
       </w:pPr>
       <w:r>
@@ -3300,7 +3300,7 @@
     </w:tbl>
     <w:p>
       <w:pPr>
-        <w:spacing w:after="120" w:before="0" w:line="276" w:lineRule="auto"/>
+        <w:spacing w:after="120" w:before="0"/>
         <w:jc w:val="both"/>
       </w:pPr>
       <w:r>
@@ -3317,7 +3317,7 @@
     </w:p>
     <w:p>
       <w:pPr>
-        <w:spacing w:after="120" w:before="0" w:line="276" w:lineRule="auto"/>
+        <w:spacing w:after="120" w:before="0"/>
         <w:jc w:val="both"/>
       </w:pPr>
       <w:r>
@@ -3334,7 +3334,7 @@
     </w:p>
     <w:p>
       <w:pPr>
-        <w:spacing w:after="120" w:before="0" w:line="276" w:lineRule="auto"/>
+        <w:spacing w:after="120" w:before="0"/>
         <w:jc w:val="both"/>
       </w:pPr>
       <w:r>
@@ -3351,7 +3351,7 @@
     </w:p>
     <w:p>
       <w:pPr>
-        <w:spacing w:after="120" w:before="0" w:line="276" w:lineRule="auto"/>
+        <w:spacing w:after="120" w:before="0"/>
         <w:jc w:val="both"/>
       </w:pPr>
       <w:r>
@@ -3368,7 +3368,7 @@
     </w:p>
     <w:p>
       <w:pPr>
-        <w:spacing w:after="120" w:before="0" w:line="276" w:lineRule="auto"/>
+        <w:spacing w:after="120" w:before="0"/>
         <w:jc w:val="both"/>
       </w:pPr>
       <w:r>
@@ -3385,7 +3385,7 @@
     </w:p>
     <w:p>
       <w:pPr>
-        <w:spacing w:after="120" w:before="0" w:line="276" w:lineRule="auto"/>
+        <w:spacing w:after="120" w:before="0"/>
         <w:jc w:val="both"/>
       </w:pPr>
       <w:r>
@@ -3402,7 +3402,7 @@
     </w:p>
     <w:p>
       <w:pPr>
-        <w:spacing w:after="120" w:before="0" w:line="276" w:lineRule="auto"/>
+        <w:spacing w:after="120" w:before="0"/>
         <w:jc w:val="both"/>
       </w:pPr>
       <w:r>
@@ -3419,7 +3419,7 @@
     </w:p>
     <w:p>
       <w:pPr>
-        <w:spacing w:after="120" w:before="0" w:line="276" w:lineRule="auto"/>
+        <w:spacing w:after="120" w:before="0"/>
         <w:jc w:val="both"/>
       </w:pPr>
       <w:r>
@@ -3436,7 +3436,7 @@
     </w:p>
     <w:p>
       <w:pPr>
-        <w:spacing w:after="120" w:before="0" w:line="276" w:lineRule="auto"/>
+        <w:spacing w:after="120" w:before="0"/>
         <w:jc w:val="both"/>
       </w:pPr>
       <w:r>
@@ -3453,7 +3453,7 @@
     </w:p>
     <w:p>
       <w:pPr>
-        <w:spacing w:after="120" w:before="0" w:line="276" w:lineRule="auto"/>
+        <w:spacing w:after="120" w:before="0"/>
         <w:jc w:val="both"/>
       </w:pPr>
       <w:r>
@@ -3470,7 +3470,7 @@
     </w:p>
     <w:p>
       <w:pPr>
-        <w:spacing w:after="120" w:before="0" w:line="276" w:lineRule="auto"/>
+        <w:spacing w:after="120" w:before="0"/>
         <w:jc w:val="both"/>
       </w:pPr>
       <w:r>
@@ -3487,7 +3487,7 @@
     </w:p>
     <w:p>
       <w:pPr>
-        <w:spacing w:after="120" w:before="0" w:line="276" w:lineRule="auto"/>
+        <w:spacing w:after="120" w:before="0"/>
         <w:jc w:val="both"/>
       </w:pPr>
       <w:r>
@@ -3522,7 +3522,7 @@
     </w:p>
     <w:p>
       <w:pPr>
-        <w:spacing w:after="120" w:before="0" w:line="276" w:lineRule="auto"/>
+        <w:spacing w:after="120" w:before="0"/>
         <w:jc w:val="both"/>
       </w:pPr>
       <w:r>
@@ -3539,7 +3539,7 @@
     </w:p>
     <w:p>
       <w:pPr>
-        <w:spacing w:after="120" w:before="0" w:line="276" w:lineRule="auto"/>
+        <w:spacing w:after="120" w:before="0"/>
         <w:jc w:val="both"/>
       </w:pPr>
       <w:r>
@@ -3556,7 +3556,7 @@
     </w:p>
     <w:p>
       <w:pPr>
-        <w:spacing w:after="120" w:before="0" w:line="276" w:lineRule="auto"/>
+        <w:spacing w:after="120" w:before="0"/>
         <w:jc w:val="both"/>
       </w:pPr>
       <w:r>
@@ -3573,7 +3573,7 @@
     </w:p>
     <w:p>
       <w:pPr>
-        <w:spacing w:after="120" w:before="0" w:line="276" w:lineRule="auto"/>
+        <w:spacing w:after="120" w:before="0"/>
         <w:jc w:val="both"/>
       </w:pPr>
       <w:r>
@@ -3590,7 +3590,7 @@
     </w:p>
     <w:p>
       <w:pPr>
-        <w:spacing w:after="120" w:before="0" w:line="276" w:lineRule="auto"/>
+        <w:spacing w:after="120" w:before="0"/>
         <w:jc w:val="both"/>
       </w:pPr>
       <w:r>
@@ -3607,7 +3607,7 @@
     </w:p>
     <w:p>
       <w:pPr>
-        <w:spacing w:after="120" w:before="0" w:line="276" w:lineRule="auto"/>
+        <w:spacing w:after="120" w:before="0"/>
         <w:jc w:val="both"/>
       </w:pPr>
       <w:r>
@@ -3624,7 +3624,7 @@
     </w:p>
     <w:p>
       <w:pPr>
-        <w:spacing w:after="120" w:before="0" w:line="276" w:lineRule="auto"/>
+        <w:spacing w:after="120" w:before="0"/>
         <w:jc w:val="both"/>
       </w:pPr>
       <w:r>
@@ -3641,7 +3641,7 @@
     </w:p>
     <w:p>
       <w:pPr>
-        <w:spacing w:after="120" w:before="0" w:line="276" w:lineRule="auto"/>
+        <w:spacing w:after="120" w:before="0"/>
         <w:jc w:val="both"/>
       </w:pPr>
       <w:r>
@@ -3658,7 +3658,7 @@
     </w:p>
     <w:p>
       <w:pPr>
-        <w:spacing w:after="120" w:before="0" w:line="276" w:lineRule="auto"/>
+        <w:spacing w:after="120" w:before="0"/>
         <w:jc w:val="both"/>
       </w:pPr>
       <w:r>
@@ -3675,7 +3675,7 @@
     </w:p>
     <w:p>
       <w:pPr>
-        <w:spacing w:after="120" w:before="0" w:line="276" w:lineRule="auto"/>
+        <w:spacing w:after="120" w:before="0"/>
         <w:jc w:val="both"/>
       </w:pPr>
       <w:r>
@@ -3692,7 +3692,7 @@
     </w:p>
     <w:p>
       <w:pPr>
-        <w:spacing w:after="120" w:before="0" w:line="276" w:lineRule="auto"/>
+        <w:spacing w:after="120" w:before="0"/>
         <w:jc w:val="both"/>
       </w:pPr>
       <w:r>
@@ -3709,7 +3709,7 @@
     </w:p>
     <w:p>
       <w:pPr>
-        <w:spacing w:after="120" w:before="0" w:line="276" w:lineRule="auto"/>
+        <w:spacing w:after="120" w:before="0"/>
         <w:jc w:val="both"/>
       </w:pPr>
       <w:r>
@@ -3726,7 +3726,7 @@
     </w:p>
     <w:p>
       <w:pPr>
-        <w:spacing w:after="120" w:before="0" w:line="276" w:lineRule="auto"/>
+        <w:spacing w:after="120" w:before="0"/>
         <w:jc w:val="both"/>
       </w:pPr>
       <w:r>
@@ -3743,7 +3743,7 @@
     </w:p>
     <w:p>
       <w:pPr>
-        <w:spacing w:after="120" w:before="0" w:line="276" w:lineRule="auto"/>
+        <w:spacing w:after="120" w:before="0"/>
         <w:jc w:val="both"/>
       </w:pPr>
       <w:r>
@@ -3760,7 +3760,7 @@
     </w:p>
     <w:p>
       <w:pPr>
-        <w:spacing w:after="120" w:before="0" w:line="276" w:lineRule="auto"/>
+        <w:spacing w:after="120" w:before="0"/>
         <w:jc w:val="both"/>
       </w:pPr>
       <w:r>
@@ -3777,7 +3777,7 @@
     </w:p>
     <w:p>
       <w:pPr>
-        <w:spacing w:after="120" w:before="0" w:line="276" w:lineRule="auto"/>
+        <w:spacing w:after="120" w:before="0"/>
         <w:jc w:val="both"/>
       </w:pPr>
       <w:r>
@@ -3794,7 +3794,7 @@
     </w:p>
     <w:p>
       <w:pPr>
-        <w:spacing w:after="120" w:before="0" w:line="276" w:lineRule="auto"/>
+        <w:spacing w:after="120" w:before="0"/>
         <w:jc w:val="both"/>
       </w:pPr>
       <w:r>
@@ -3811,7 +3811,7 @@
     </w:p>
     <w:p>
       <w:pPr>
-        <w:spacing w:after="120" w:before="0" w:line="276" w:lineRule="auto"/>
+        <w:spacing w:after="120" w:before="0"/>
         <w:jc w:val="both"/>
       </w:pPr>
       <w:r>
@@ -3828,7 +3828,7 @@
     </w:p>
     <w:p>
       <w:pPr>
-        <w:spacing w:after="120" w:before="0" w:line="276" w:lineRule="auto"/>
+        <w:spacing w:after="120" w:before="0"/>
         <w:jc w:val="both"/>
       </w:pPr>
       <w:r>
@@ -3845,7 +3845,7 @@
     </w:p>
     <w:p>
       <w:pPr>
-        <w:spacing w:after="120" w:before="0" w:line="276" w:lineRule="auto"/>
+        <w:spacing w:after="120" w:before="0"/>
         <w:jc w:val="both"/>
       </w:pPr>
       <w:r>
@@ -3862,7 +3862,7 @@
     </w:p>
     <w:p>
       <w:pPr>
-        <w:spacing w:after="120" w:before="0" w:line="276" w:lineRule="auto"/>
+        <w:spacing w:after="120" w:before="0"/>
         <w:jc w:val="both"/>
       </w:pPr>
       <w:r>
@@ -3879,7 +3879,7 @@
     </w:p>
     <w:p>
       <w:pPr>
-        <w:spacing w:after="120" w:before="0" w:line="276" w:lineRule="auto"/>
+        <w:spacing w:after="120" w:before="0"/>
         <w:jc w:val="both"/>
       </w:pPr>
       <w:r>
@@ -3896,7 +3896,7 @@
     </w:p>
     <w:p>
       <w:pPr>
-        <w:spacing w:after="120" w:before="0" w:line="276" w:lineRule="auto"/>
+        <w:spacing w:after="120" w:before="0"/>
         <w:jc w:val="both"/>
       </w:pPr>
       <w:r>
@@ -3913,7 +3913,7 @@
     </w:p>
     <w:p>
       <w:pPr>
-        <w:spacing w:after="120" w:before="0" w:line="276" w:lineRule="auto"/>
+        <w:spacing w:after="120" w:before="0"/>
         <w:jc w:val="both"/>
       </w:pPr>
       <w:r>
@@ -3930,7 +3930,7 @@
     </w:p>
     <w:p>
       <w:pPr>
-        <w:spacing w:after="120" w:before="0" w:line="276" w:lineRule="auto"/>
+        <w:spacing w:after="120" w:before="0"/>
         <w:jc w:val="both"/>
       </w:pPr>
       <w:r>
@@ -3947,7 +3947,7 @@
     </w:p>
     <w:p>
       <w:pPr>
-        <w:spacing w:after="120" w:before="0" w:line="276" w:lineRule="auto"/>
+        <w:spacing w:after="120" w:before="0"/>
         <w:jc w:val="both"/>
       </w:pPr>
       <w:r>
@@ -3982,7 +3982,7 @@
     </w:p>
     <w:p>
       <w:pPr>
-        <w:spacing w:after="120" w:before="0" w:line="276" w:lineRule="auto"/>
+        <w:spacing w:after="120" w:before="0"/>
         <w:jc w:val="both"/>
       </w:pPr>
       <w:r>
@@ -3999,7 +3999,7 @@
     </w:p>
     <w:p>
       <w:pPr>
-        <w:spacing w:after="120" w:before="0" w:line="276" w:lineRule="auto"/>
+        <w:spacing w:after="120" w:before="0"/>
         <w:jc w:val="both"/>
       </w:pPr>
       <w:r>
@@ -4016,7 +4016,7 @@
     </w:p>
     <w:p>
       <w:pPr>
-        <w:spacing w:after="120" w:before="0" w:line="276" w:lineRule="auto"/>
+        <w:spacing w:after="120" w:before="0"/>
         <w:jc w:val="both"/>
       </w:pPr>
       <w:r>
@@ -4033,7 +4033,7 @@
     </w:p>
     <w:p>
       <w:pPr>
-        <w:spacing w:after="120" w:before="0" w:line="276" w:lineRule="auto"/>
+        <w:spacing w:after="120" w:before="0"/>
         <w:jc w:val="both"/>
       </w:pPr>
       <w:r>
@@ -4050,7 +4050,7 @@
     </w:p>
     <w:p>
       <w:pPr>
-        <w:spacing w:after="120" w:before="0" w:line="276" w:lineRule="auto"/>
+        <w:spacing w:after="120" w:before="0"/>
         <w:jc w:val="both"/>
       </w:pPr>
       <w:r>
@@ -4067,7 +4067,7 @@
     </w:p>
     <w:p>
       <w:pPr>
-        <w:spacing w:after="120" w:before="0" w:line="276" w:lineRule="auto"/>
+        <w:spacing w:after="120" w:before="0"/>
         <w:jc w:val="both"/>
       </w:pPr>
       <w:r>
@@ -4084,7 +4084,7 @@
     </w:p>
     <w:p>
       <w:pPr>
-        <w:spacing w:after="120" w:before="0" w:line="276" w:lineRule="auto"/>
+        <w:spacing w:after="120" w:before="0"/>
         <w:jc w:val="both"/>
       </w:pPr>
       <w:r>
@@ -4101,7 +4101,7 @@
     </w:p>
     <w:p>
       <w:pPr>
-        <w:spacing w:after="120" w:before="0" w:line="276" w:lineRule="auto"/>
+        <w:spacing w:after="120" w:before="0"/>
         <w:jc w:val="both"/>
       </w:pPr>
       <w:r>
@@ -4118,7 +4118,7 @@
     </w:p>
     <w:p>
       <w:pPr>
-        <w:spacing w:after="120" w:before="0" w:line="276" w:lineRule="auto"/>
+        <w:spacing w:after="120" w:before="0"/>
         <w:jc w:val="both"/>
       </w:pPr>
       <w:r>
@@ -4135,7 +4135,7 @@
     </w:p>
     <w:p>
       <w:pPr>
-        <w:spacing w:after="120" w:before="0" w:line="276" w:lineRule="auto"/>
+        <w:spacing w:after="120" w:before="0"/>
         <w:jc w:val="both"/>
       </w:pPr>
       <w:r>
@@ -4152,7 +4152,7 @@
     </w:p>
     <w:p>
       <w:pPr>
-        <w:spacing w:after="120" w:before="0" w:line="276" w:lineRule="auto"/>
+        <w:spacing w:after="120" w:before="0"/>
         <w:jc w:val="both"/>
       </w:pPr>
       <w:r>
@@ -4169,7 +4169,7 @@
     </w:p>
     <w:p>
       <w:pPr>
-        <w:spacing w:after="120" w:before="0" w:line="276" w:lineRule="auto"/>
+        <w:spacing w:after="120" w:before="0"/>
         <w:jc w:val="both"/>
       </w:pPr>
       <w:r>
@@ -4186,7 +4186,7 @@
     </w:p>
     <w:p>
       <w:pPr>
-        <w:spacing w:after="120" w:before="0" w:line="276" w:lineRule="auto"/>
+        <w:spacing w:after="120" w:before="0"/>
         <w:jc w:val="both"/>
       </w:pPr>
       <w:r>
@@ -4203,7 +4203,7 @@
     </w:p>
     <w:p>
       <w:pPr>
-        <w:spacing w:after="120" w:before="0" w:line="276" w:lineRule="auto"/>
+        <w:spacing w:after="120" w:before="0"/>
         <w:jc w:val="both"/>
       </w:pPr>
       <w:r>
@@ -4220,7 +4220,7 @@
     </w:p>
     <w:p>
       <w:pPr>
-        <w:spacing w:after="120" w:before="0" w:line="276" w:lineRule="auto"/>
+        <w:spacing w:after="120" w:before="0"/>
         <w:jc w:val="both"/>
       </w:pPr>
       <w:r>
@@ -4237,7 +4237,7 @@
     </w:p>
     <w:p>
       <w:pPr>
-        <w:spacing w:after="120" w:before="0" w:line="276" w:lineRule="auto"/>
+        <w:spacing w:after="120" w:before="0"/>
         <w:jc w:val="both"/>
       </w:pPr>
       <w:r>
@@ -4254,7 +4254,7 @@
     </w:p>
     <w:p>
       <w:pPr>
-        <w:spacing w:after="120" w:before="0" w:line="276" w:lineRule="auto"/>
+        <w:spacing w:after="120" w:before="0"/>
         <w:jc w:val="both"/>
       </w:pPr>
       <w:r>
@@ -4271,7 +4271,7 @@
     </w:p>
     <w:p>
       <w:pPr>
-        <w:spacing w:after="120" w:before="0" w:line="276" w:lineRule="auto"/>
+        <w:spacing w:after="120" w:before="0"/>
         <w:jc w:val="both"/>
       </w:pPr>
       <w:r>
@@ -4288,7 +4288,7 @@
     </w:p>
     <w:p>
       <w:pPr>
-        <w:spacing w:after="120" w:before="0" w:line="276" w:lineRule="auto"/>
+        <w:spacing w:after="120" w:before="0"/>
         <w:jc w:val="both"/>
       </w:pPr>
       <w:r>
@@ -4305,7 +4305,7 @@
     </w:p>
     <w:p>
       <w:pPr>
-        <w:spacing w:after="120" w:before="0" w:line="276" w:lineRule="auto"/>
+        <w:spacing w:after="120" w:before="0"/>
         <w:jc w:val="both"/>
       </w:pPr>
       <w:r>
@@ -4322,7 +4322,7 @@
     </w:p>
     <w:p>
       <w:pPr>
-        <w:spacing w:after="120" w:before="0" w:line="276" w:lineRule="auto"/>
+        <w:spacing w:after="120" w:before="0"/>
         <w:jc w:val="both"/>
       </w:pPr>
       <w:r>
@@ -4339,7 +4339,7 @@
     </w:p>
     <w:p>
       <w:pPr>
-        <w:spacing w:after="120" w:before="0" w:line="276" w:lineRule="auto"/>
+        <w:spacing w:after="120" w:before="0"/>
         <w:jc w:val="both"/>
       </w:pPr>
       <w:r>
@@ -4356,7 +4356,7 @@
     </w:p>
     <w:p>
       <w:pPr>
-        <w:spacing w:after="120" w:before="0" w:line="276" w:lineRule="auto"/>
+        <w:spacing w:after="120" w:before="0"/>
         <w:jc w:val="both"/>
       </w:pPr>
       <w:r>
@@ -4391,7 +4391,7 @@
     </w:p>
     <w:p>
       <w:pPr>
-        <w:spacing w:after="120" w:before="0" w:line="276" w:lineRule="auto"/>
+        <w:spacing w:after="120" w:before="0"/>
         <w:jc w:val="both"/>
       </w:pPr>
       <w:r>
@@ -4408,7 +4408,7 @@
     </w:p>
     <w:p>
       <w:pPr>
-        <w:spacing w:after="120" w:before="0" w:line="276" w:lineRule="auto"/>
+        <w:spacing w:after="120" w:before="0"/>
         <w:jc w:val="both"/>
       </w:pPr>
       <w:r>
@@ -4425,7 +4425,7 @@
     </w:p>
     <w:p>
       <w:pPr>
-        <w:spacing w:after="120" w:before="0" w:line="276" w:lineRule="auto"/>
+        <w:spacing w:after="120" w:before="0"/>
         <w:jc w:val="both"/>
       </w:pPr>
       <w:r>
@@ -4442,7 +4442,7 @@
     </w:p>
     <w:p>
       <w:pPr>
-        <w:spacing w:after="120" w:before="0" w:line="276" w:lineRule="auto"/>
+        <w:spacing w:after="120" w:before="0"/>
         <w:jc w:val="both"/>
       </w:pPr>
       <w:r>
@@ -4459,7 +4459,7 @@
     </w:p>
     <w:p>
       <w:pPr>
-        <w:spacing w:after="120" w:before="0" w:line="276" w:lineRule="auto"/>
+        <w:spacing w:after="120" w:before="0"/>
         <w:jc w:val="both"/>
       </w:pPr>
       <w:r>
@@ -4476,7 +4476,7 @@
     </w:p>
     <w:p>
       <w:pPr>
-        <w:spacing w:after="120" w:before="0" w:line="276" w:lineRule="auto"/>
+        <w:spacing w:after="120" w:before="0"/>
         <w:jc w:val="both"/>
       </w:pPr>
       <w:r>
@@ -4493,7 +4493,7 @@
     </w:p>
     <w:p>
       <w:pPr>
-        <w:spacing w:after="120" w:before="0" w:line="276" w:lineRule="auto"/>
+        <w:spacing w:after="120" w:before="0"/>
         <w:jc w:val="both"/>
       </w:pPr>
       <w:r>
@@ -4510,7 +4510,7 @@
     </w:p>
     <w:p>
       <w:pPr>
-        <w:spacing w:after="120" w:before="0" w:line="276" w:lineRule="auto"/>
+        <w:spacing w:after="120" w:before="0"/>
         <w:jc w:val="both"/>
       </w:pPr>
       <w:r>
@@ -4527,7 +4527,7 @@
     </w:p>
     <w:p>
       <w:pPr>
-        <w:spacing w:after="120" w:before="0" w:line="276" w:lineRule="auto"/>
+        <w:spacing w:after="120" w:before="0"/>
         <w:jc w:val="both"/>
       </w:pPr>
       <w:r>
@@ -4544,7 +4544,7 @@
     </w:p>
     <w:p>
       <w:pPr>
-        <w:spacing w:after="120" w:before="0" w:line="276" w:lineRule="auto"/>
+        <w:spacing w:after="120" w:before="0"/>
         <w:jc w:val="both"/>
       </w:pPr>
       <w:r>
@@ -4561,7 +4561,7 @@
     </w:p>
     <w:p>
       <w:pPr>
-        <w:spacing w:after="120" w:before="0" w:line="276" w:lineRule="auto"/>
+        <w:spacing w:after="120" w:before="0"/>
         <w:jc w:val="both"/>
       </w:pPr>
       <w:r>
@@ -4578,7 +4578,7 @@
     </w:p>
     <w:p>
       <w:pPr>
-        <w:spacing w:after="120" w:before="0" w:line="276" w:lineRule="auto"/>
+        <w:spacing w:after="120" w:before="0"/>
         <w:jc w:val="both"/>
       </w:pPr>
       <w:r>
@@ -4595,7 +4595,7 @@
     </w:p>
     <w:p>
       <w:pPr>
-        <w:spacing w:after="120" w:before="0" w:line="276" w:lineRule="auto"/>
+        <w:spacing w:after="120" w:before="0"/>
         <w:jc w:val="both"/>
       </w:pPr>
       <w:r>
@@ -4612,7 +4612,7 @@
     </w:p>
     <w:p>
       <w:pPr>
-        <w:spacing w:after="120" w:before="0" w:line="276" w:lineRule="auto"/>
+        <w:spacing w:after="120" w:before="0"/>
         <w:jc w:val="both"/>
       </w:pPr>
       <w:r>
@@ -4629,7 +4629,7 @@
     </w:p>
     <w:p>
       <w:pPr>
-        <w:spacing w:after="120" w:before="0" w:line="276" w:lineRule="auto"/>
+        <w:spacing w:after="120" w:before="0"/>
         <w:jc w:val="both"/>
       </w:pPr>
       <w:r>
@@ -4646,7 +4646,7 @@
     </w:p>
     <w:p>
       <w:pPr>
-        <w:spacing w:after="120" w:before="0" w:line="276" w:lineRule="auto"/>
+        <w:spacing w:after="120" w:before="0"/>
         <w:jc w:val="both"/>
       </w:pPr>
       <w:r>
@@ -4663,7 +4663,7 @@
     </w:p>
     <w:p>
       <w:pPr>
-        <w:spacing w:after="120" w:before="0" w:line="276" w:lineRule="auto"/>
+        <w:spacing w:after="120" w:before="0"/>
         <w:jc w:val="both"/>
       </w:pPr>
       <w:r>
@@ -4680,7 +4680,7 @@
     </w:p>
     <w:p>
       <w:pPr>
-        <w:spacing w:after="120" w:before="0" w:line="276" w:lineRule="auto"/>
+        <w:spacing w:after="120" w:before="0"/>
         <w:jc w:val="both"/>
       </w:pPr>
       <w:r>
@@ -4697,7 +4697,7 @@
     </w:p>
     <w:p>
       <w:pPr>
-        <w:spacing w:after="120" w:before="0" w:line="276" w:lineRule="auto"/>
+        <w:spacing w:after="120" w:before="0"/>
         <w:jc w:val="both"/>
       </w:pPr>
       <w:r>
@@ -4714,7 +4714,7 @@
     </w:p>
     <w:p>
       <w:pPr>
-        <w:spacing w:after="120" w:before="0" w:line="276" w:lineRule="auto"/>
+        <w:spacing w:after="120" w:before="0"/>
         <w:jc w:val="both"/>
       </w:pPr>
       <w:r>
@@ -4731,7 +4731,7 @@
     </w:p>
     <w:p>
       <w:pPr>
-        <w:spacing w:after="120" w:before="0" w:line="276" w:lineRule="auto"/>
+        <w:spacing w:after="120" w:before="0"/>
         <w:jc w:val="both"/>
       </w:pPr>
       <w:r>
@@ -4748,7 +4748,7 @@
     </w:p>
     <w:p>
       <w:pPr>
-        <w:spacing w:after="120" w:before="0" w:line="276" w:lineRule="auto"/>
+        <w:spacing w:after="120" w:before="0"/>
         <w:jc w:val="both"/>
       </w:pPr>
       <w:r>
@@ -4765,7 +4765,7 @@
     </w:p>
     <w:p>
       <w:pPr>
-        <w:spacing w:after="120" w:before="0" w:line="276" w:lineRule="auto"/>
+        <w:spacing w:after="120" w:before="0"/>
         <w:jc w:val="both"/>
       </w:pPr>
       <w:r>
@@ -4782,7 +4782,7 @@
     </w:p>
     <w:p>
       <w:pPr>
-        <w:spacing w:after="120" w:before="0" w:line="276" w:lineRule="auto"/>
+        <w:spacing w:after="120" w:before="0"/>
         <w:jc w:val="both"/>
       </w:pPr>
       <w:r>
@@ -4799,7 +4799,7 @@
     </w:p>
     <w:p>
       <w:pPr>
-        <w:spacing w:after="120" w:before="0" w:line="276" w:lineRule="auto"/>
+        <w:spacing w:after="120" w:before="0"/>
         <w:jc w:val="both"/>
       </w:pPr>
       <w:r>
@@ -4834,7 +4834,7 @@
     </w:p>
     <w:p>
       <w:pPr>
-        <w:spacing w:after="120" w:before="0" w:line="276" w:lineRule="auto"/>
+        <w:spacing w:after="120" w:before="0"/>
         <w:jc w:val="both"/>
       </w:pPr>
       <w:r>
@@ -4851,7 +4851,7 @@
     </w:p>
     <w:p>
       <w:pPr>
-        <w:spacing w:after="120" w:before="0" w:line="276" w:lineRule="auto"/>
+        <w:spacing w:after="120" w:before="0"/>
         <w:jc w:val="both"/>
       </w:pPr>
       <w:r>
@@ -4868,7 +4868,7 @@
     </w:p>
     <w:p>
       <w:pPr>
-        <w:spacing w:after="120" w:before="0" w:line="276" w:lineRule="auto"/>
+        <w:spacing w:after="120" w:before="0"/>
         <w:jc w:val="both"/>
       </w:pPr>
       <w:r>
@@ -4885,7 +4885,7 @@
     </w:p>
     <w:p>
       <w:pPr>
-        <w:spacing w:after="120" w:before="0" w:line="276" w:lineRule="auto"/>
+        <w:spacing w:after="120" w:before="0"/>
         <w:jc w:val="both"/>
       </w:pPr>
       <w:r>
@@ -4902,7 +4902,7 @@
     </w:p>
     <w:p>
       <w:pPr>
-        <w:spacing w:after="120" w:before="0" w:line="276" w:lineRule="auto"/>
+        <w:spacing w:after="120" w:before="0"/>
         <w:jc w:val="both"/>
       </w:pPr>
       <w:r>
@@ -4919,7 +4919,7 @@
     </w:p>
     <w:p>
       <w:pPr>
-        <w:spacing w:after="120" w:before="0" w:line="276" w:lineRule="auto"/>
+        <w:spacing w:after="120" w:before="0"/>
         <w:jc w:val="both"/>
       </w:pPr>
       <w:r>
@@ -4936,7 +4936,7 @@
     </w:p>
     <w:p>
       <w:pPr>
-        <w:spacing w:after="120" w:before="0" w:line="276" w:lineRule="auto"/>
+        <w:spacing w:after="120" w:before="0"/>
         <w:jc w:val="both"/>
       </w:pPr>
       <w:r>
@@ -4953,7 +4953,7 @@
     </w:p>
     <w:p>
       <w:pPr>
-        <w:spacing w:after="120" w:before="0" w:line="276" w:lineRule="auto"/>
+        <w:spacing w:after="120" w:before="0"/>
         <w:jc w:val="both"/>
       </w:pPr>
       <w:r>
@@ -4970,7 +4970,7 @@
     </w:p>
     <w:p>
       <w:pPr>
-        <w:spacing w:after="120" w:before="0" w:line="276" w:lineRule="auto"/>
+        <w:spacing w:after="120" w:before="0"/>
         <w:jc w:val="both"/>
       </w:pPr>
       <w:r>
@@ -4987,7 +4987,7 @@
     </w:p>
     <w:p>
       <w:pPr>
-        <w:spacing w:after="120" w:before="0" w:line="276" w:lineRule="auto"/>
+        <w:spacing w:after="120" w:before="0"/>
         <w:jc w:val="both"/>
       </w:pPr>
       <w:r>
@@ -5004,7 +5004,7 @@
     </w:p>
     <w:p>
       <w:pPr>
-        <w:spacing w:after="120" w:before="0" w:line="276" w:lineRule="auto"/>
+        <w:spacing w:after="120" w:before="0"/>
         <w:jc w:val="both"/>
       </w:pPr>
       <w:r>
@@ -5021,7 +5021,7 @@
     </w:p>
     <w:p>
       <w:pPr>
-        <w:spacing w:after="120" w:before="0" w:line="276" w:lineRule="auto"/>
+        <w:spacing w:after="120" w:before="0"/>
         <w:jc w:val="both"/>
       </w:pPr>
       <w:r>
@@ -5038,7 +5038,7 @@
     </w:p>
     <w:p>
       <w:pPr>
-        <w:spacing w:after="120" w:before="0" w:line="276" w:lineRule="auto"/>
+        <w:spacing w:after="120" w:before="0"/>
         <w:jc w:val="both"/>
       </w:pPr>
       <w:r>
@@ -5055,7 +5055,7 @@
     </w:p>
     <w:p>
       <w:pPr>
-        <w:spacing w:after="120" w:before="0" w:line="276" w:lineRule="auto"/>
+        <w:spacing w:after="120" w:before="0"/>
         <w:jc w:val="both"/>
       </w:pPr>
       <w:r>
@@ -5072,7 +5072,7 @@
     </w:p>
     <w:p>
       <w:pPr>
-        <w:spacing w:after="120" w:before="0" w:line="276" w:lineRule="auto"/>
+        <w:spacing w:after="120" w:before="0"/>
         <w:jc w:val="both"/>
       </w:pPr>
       <w:r>
@@ -5089,7 +5089,7 @@
     </w:p>
     <w:p>
       <w:pPr>
-        <w:spacing w:after="120" w:before="0" w:line="276" w:lineRule="auto"/>
+        <w:spacing w:after="120" w:before="0"/>
         <w:jc w:val="both"/>
       </w:pPr>
       <w:r>
@@ -5106,7 +5106,7 @@
     </w:p>
     <w:p>
       <w:pPr>
-        <w:spacing w:after="120" w:before="0" w:line="276" w:lineRule="auto"/>
+        <w:spacing w:after="120" w:before="0"/>
         <w:jc w:val="both"/>
       </w:pPr>
       <w:r>
@@ -5123,7 +5123,7 @@
     </w:p>
     <w:p>
       <w:pPr>
-        <w:spacing w:after="120" w:before="0" w:line="276" w:lineRule="auto"/>
+        <w:spacing w:after="120" w:before="0"/>
         <w:jc w:val="both"/>
       </w:pPr>
       <w:r>
@@ -5140,7 +5140,7 @@
     </w:p>
     <w:p>
       <w:pPr>
-        <w:spacing w:after="120" w:before="0" w:line="276" w:lineRule="auto"/>
+        <w:spacing w:after="120" w:before="0"/>
         <w:jc w:val="both"/>
       </w:pPr>
       <w:r>
@@ -5157,7 +5157,7 @@
     </w:p>
     <w:p>
       <w:pPr>
-        <w:spacing w:after="120" w:before="0" w:line="276" w:lineRule="auto"/>
+        <w:spacing w:after="120" w:before="0"/>
         <w:jc w:val="both"/>
       </w:pPr>
       <w:r>
@@ -5174,7 +5174,7 @@
     </w:p>
     <w:p>
       <w:pPr>
-        <w:spacing w:after="120" w:before="0" w:line="276" w:lineRule="auto"/>
+        <w:spacing w:after="120" w:before="0"/>
         <w:jc w:val="both"/>
       </w:pPr>
       <w:r>
@@ -5191,7 +5191,7 @@
     </w:p>
     <w:p>
       <w:pPr>
-        <w:spacing w:after="120" w:before="0" w:line="276" w:lineRule="auto"/>
+        <w:spacing w:after="120" w:before="0"/>
         <w:jc w:val="both"/>
       </w:pPr>
       <w:r>
@@ -5226,7 +5226,7 @@
     </w:p>
     <w:p>
       <w:pPr>
-        <w:spacing w:after="120" w:before="0" w:line="276" w:lineRule="auto"/>
+        <w:spacing w:after="120" w:before="0"/>
         <w:jc w:val="both"/>
       </w:pPr>
       <w:r>
@@ -5243,7 +5243,7 @@
     </w:p>
     <w:p>
       <w:pPr>
-        <w:spacing w:after="120" w:before="0" w:line="276" w:lineRule="auto"/>
+        <w:spacing w:after="120" w:before="0"/>
         <w:jc w:val="both"/>
       </w:pPr>
       <w:r>
@@ -5260,7 +5260,7 @@
     </w:p>
     <w:p>
       <w:pPr>
-        <w:spacing w:after="120" w:before="0" w:line="276" w:lineRule="auto"/>
+        <w:spacing w:after="120" w:before="0"/>
         <w:jc w:val="both"/>
       </w:pPr>
       <w:r>
@@ -5277,7 +5277,7 @@
     </w:p>
     <w:p>
       <w:pPr>
-        <w:spacing w:after="120" w:before="0" w:line="276" w:lineRule="auto"/>
+        <w:spacing w:after="120" w:before="0"/>
         <w:jc w:val="both"/>
       </w:pPr>
       <w:r>
@@ -5294,7 +5294,7 @@
     </w:p>
     <w:p>
       <w:pPr>
-        <w:spacing w:after="120" w:before="0" w:line="276" w:lineRule="auto"/>
+        <w:spacing w:after="120" w:before="0"/>
         <w:jc w:val="both"/>
       </w:pPr>
       <w:r>
@@ -5311,7 +5311,7 @@
     </w:p>
     <w:p>
       <w:pPr>
-        <w:spacing w:after="120" w:before="0" w:line="276" w:lineRule="auto"/>
+        <w:spacing w:after="120" w:before="0"/>
         <w:jc w:val="both"/>
       </w:pPr>
       <w:r>
@@ -5328,7 +5328,7 @@
     </w:p>
     <w:p>
       <w:pPr>
-        <w:spacing w:after="120" w:before="0" w:line="276" w:lineRule="auto"/>
+        <w:spacing w:after="120" w:before="0"/>
         <w:jc w:val="both"/>
       </w:pPr>
       <w:r>
@@ -5345,7 +5345,7 @@
     </w:p>
     <w:p>
       <w:pPr>
-        <w:spacing w:after="120" w:before="0" w:line="276" w:lineRule="auto"/>
+        <w:spacing w:after="120" w:before="0"/>
         <w:jc w:val="both"/>
       </w:pPr>
       <w:r>
@@ -5362,7 +5362,7 @@
     </w:p>
     <w:p>
       <w:pPr>
-        <w:spacing w:after="120" w:before="0" w:line="276" w:lineRule="auto"/>
+        <w:spacing w:after="120" w:before="0"/>
         <w:jc w:val="both"/>
       </w:pPr>
       <w:r>
@@ -5379,7 +5379,7 @@
     </w:p>
     <w:p>
       <w:pPr>
-        <w:spacing w:after="120" w:before="0" w:line="276" w:lineRule="auto"/>
+        <w:spacing w:after="120" w:before="0"/>
         <w:jc w:val="both"/>
       </w:pPr>
       <w:r>
@@ -5396,7 +5396,7 @@
     </w:p>
     <w:p>
       <w:pPr>
-        <w:spacing w:after="120" w:before="0" w:line="276" w:lineRule="auto"/>
+        <w:spacing w:after="120" w:before="0"/>
         <w:jc w:val="both"/>
       </w:pPr>
       <w:r>
@@ -5413,7 +5413,7 @@
     </w:p>
     <w:p>
       <w:pPr>
-        <w:spacing w:after="120" w:before="0" w:line="276" w:lineRule="auto"/>
+        <w:spacing w:after="120" w:before="0"/>
         <w:jc w:val="both"/>
       </w:pPr>
       <w:r>
@@ -5430,7 +5430,7 @@
     </w:p>
     <w:p>
       <w:pPr>
-        <w:spacing w:after="120" w:before="0" w:line="276" w:lineRule="auto"/>
+        <w:spacing w:after="120" w:before="0"/>
         <w:jc w:val="both"/>
       </w:pPr>
       <w:r>
@@ -5447,7 +5447,7 @@
     </w:p>
     <w:p>
       <w:pPr>
-        <w:spacing w:after="120" w:before="0" w:line="276" w:lineRule="auto"/>
+        <w:spacing w:after="120" w:before="0"/>
         <w:jc w:val="both"/>
       </w:pPr>
       <w:r>
@@ -5464,7 +5464,7 @@
     </w:p>
     <w:p>
       <w:pPr>
-        <w:spacing w:after="120" w:before="0" w:line="276" w:lineRule="auto"/>
+        <w:spacing w:after="120" w:before="0"/>
         <w:jc w:val="both"/>
       </w:pPr>
       <w:r>
@@ -5481,7 +5481,7 @@
     </w:p>
     <w:p>
       <w:pPr>
-        <w:spacing w:after="120" w:before="0" w:line="276" w:lineRule="auto"/>
+        <w:spacing w:after="120" w:before="0"/>
         <w:jc w:val="both"/>
       </w:pPr>
       <w:r>
@@ -5498,7 +5498,7 @@
     </w:p>
     <w:p>
       <w:pPr>
-        <w:spacing w:after="120" w:before="0" w:line="276" w:lineRule="auto"/>
+        <w:spacing w:after="120" w:before="0"/>
         <w:jc w:val="both"/>
       </w:pPr>
       <w:r>
@@ -5515,7 +5515,7 @@
     </w:p>
     <w:p>
       <w:pPr>
-        <w:spacing w:after="120" w:before="0" w:line="276" w:lineRule="auto"/>
+        <w:spacing w:after="120" w:before="0"/>
         <w:jc w:val="both"/>
       </w:pPr>
       <w:r>
@@ -5532,7 +5532,7 @@
     </w:p>
     <w:p>
       <w:pPr>
-        <w:spacing w:after="120" w:before="0" w:line="276" w:lineRule="auto"/>
+        <w:spacing w:after="120" w:before="0"/>
         <w:jc w:val="both"/>
       </w:pPr>
       <w:r>
@@ -5549,7 +5549,7 @@
     </w:p>
     <w:p>
       <w:pPr>
-        <w:spacing w:after="120" w:before="0" w:line="276" w:lineRule="auto"/>
+        <w:spacing w:after="120" w:before="0"/>
         <w:jc w:val="both"/>
       </w:pPr>
       <w:r>
@@ -5584,7 +5584,7 @@
     </w:p>
     <w:p>
       <w:pPr>
-        <w:spacing w:after="120" w:before="0" w:line="276" w:lineRule="auto"/>
+        <w:spacing w:after="120" w:before="0"/>
         <w:jc w:val="both"/>
       </w:pPr>
       <w:r>
@@ -5601,7 +5601,7 @@
     </w:p>
     <w:p>
       <w:pPr>
-        <w:spacing w:after="120" w:before="0" w:line="276" w:lineRule="auto"/>
+        <w:spacing w:after="120" w:before="0"/>
         <w:jc w:val="both"/>
       </w:pPr>
       <w:r>
@@ -5618,7 +5618,7 @@
     </w:p>
     <w:p>
       <w:pPr>
-        <w:spacing w:after="120" w:before="0" w:line="276" w:lineRule="auto"/>
+        <w:spacing w:after="120" w:before="0"/>
         <w:jc w:val="both"/>
       </w:pPr>
       <w:r>
@@ -5635,7 +5635,7 @@
     </w:p>
     <w:p>
       <w:pPr>
-        <w:spacing w:after="120" w:before="0" w:line="276" w:lineRule="auto"/>
+        <w:spacing w:after="120" w:before="0"/>
         <w:jc w:val="both"/>
       </w:pPr>
       <w:r>
@@ -5652,7 +5652,7 @@
     </w:p>
     <w:p>
       <w:pPr>
-        <w:spacing w:after="120" w:before="0" w:line="276" w:lineRule="auto"/>
+        <w:spacing w:after="120" w:before="0"/>
         <w:jc w:val="both"/>
       </w:pPr>
       <w:r>
@@ -5669,7 +5669,7 @@
     </w:p>
     <w:p>
       <w:pPr>
-        <w:spacing w:after="120" w:before="0" w:line="276" w:lineRule="auto"/>
+        <w:spacing w:after="120" w:before="0"/>
         <w:jc w:val="both"/>
       </w:pPr>
       <w:r>
@@ -5686,7 +5686,7 @@
     </w:p>
     <w:p>
       <w:pPr>
-        <w:spacing w:after="120" w:before="0" w:line="276" w:lineRule="auto"/>
+        <w:spacing w:after="120" w:before="0"/>
         <w:jc w:val="both"/>
       </w:pPr>
       <w:r>
@@ -5703,7 +5703,7 @@
     </w:p>
     <w:p>
       <w:pPr>
-        <w:spacing w:after="120" w:before="0" w:line="276" w:lineRule="auto"/>
+        <w:spacing w:after="120" w:before="0"/>
         <w:jc w:val="both"/>
       </w:pPr>
       <w:r>
@@ -5720,7 +5720,7 @@
     </w:p>
     <w:p>
       <w:pPr>
-        <w:spacing w:after="120" w:before="0" w:line="276" w:lineRule="auto"/>
+        <w:spacing w:after="120" w:before="0"/>
         <w:jc w:val="both"/>
       </w:pPr>
       <w:r>
@@ -5737,7 +5737,7 @@
     </w:p>
     <w:p>
       <w:pPr>
-        <w:spacing w:after="120" w:before="0" w:line="276" w:lineRule="auto"/>
+        <w:spacing w:after="120" w:before="0"/>
         <w:jc w:val="both"/>
       </w:pPr>
       <w:r>
@@ -5754,7 +5754,7 @@
     </w:p>
     <w:p>
       <w:pPr>
-        <w:spacing w:after="120" w:before="0" w:line="276" w:lineRule="auto"/>
+        <w:spacing w:after="120" w:before="0"/>
         <w:jc w:val="both"/>
       </w:pPr>
       <w:r>
@@ -5771,7 +5771,7 @@
     </w:p>
     <w:p>
       <w:pPr>
-        <w:spacing w:after="120" w:before="0" w:line="276" w:lineRule="auto"/>
+        <w:spacing w:after="120" w:before="0"/>
         <w:jc w:val="both"/>
       </w:pPr>
       <w:r>
@@ -5788,7 +5788,7 @@
     </w:p>
     <w:p>
       <w:pPr>
-        <w:spacing w:after="120" w:before="0" w:line="276" w:lineRule="auto"/>
+        <w:spacing w:after="120" w:before="0"/>
         <w:jc w:val="both"/>
       </w:pPr>
       <w:r>
@@ -5805,7 +5805,7 @@
     </w:p>
     <w:p>
       <w:pPr>
-        <w:spacing w:after="120" w:before="0" w:line="276" w:lineRule="auto"/>
+        <w:spacing w:after="120" w:before="0"/>
         <w:jc w:val="both"/>
       </w:pPr>
       <w:r>
@@ -5822,7 +5822,7 @@
     </w:p>
     <w:p>
       <w:pPr>
-        <w:spacing w:after="120" w:before="0" w:line="276" w:lineRule="auto"/>
+        <w:spacing w:after="120" w:before="0"/>
         <w:jc w:val="both"/>
       </w:pPr>
       <w:r>
@@ -5839,7 +5839,7 @@
     </w:p>
     <w:p>
       <w:pPr>
-        <w:spacing w:after="120" w:before="0" w:line="276" w:lineRule="auto"/>
+        <w:spacing w:after="120" w:before="0"/>
         <w:jc w:val="both"/>
       </w:pPr>
       <w:r>
@@ -5856,7 +5856,7 @@
     </w:p>
     <w:p>
       <w:pPr>
-        <w:spacing w:after="120" w:before="0" w:line="276" w:lineRule="auto"/>
+        <w:spacing w:after="120" w:before="0"/>
         <w:jc w:val="both"/>
       </w:pPr>
       <w:r>
@@ -5873,7 +5873,7 @@
     </w:p>
     <w:p>
       <w:pPr>
-        <w:spacing w:after="120" w:before="0" w:line="276" w:lineRule="auto"/>
+        <w:spacing w:after="120" w:before="0"/>
         <w:jc w:val="both"/>
       </w:pPr>
       <w:r>
@@ -5890,7 +5890,7 @@
     </w:p>
     <w:p>
       <w:pPr>
-        <w:spacing w:after="120" w:before="0" w:line="276" w:lineRule="auto"/>
+        <w:spacing w:after="120" w:before="0"/>
         <w:jc w:val="both"/>
       </w:pPr>
       <w:r>
@@ -5907,7 +5907,7 @@
     </w:p>
     <w:p>
       <w:pPr>
-        <w:spacing w:after="120" w:before="0" w:line="276" w:lineRule="auto"/>
+        <w:spacing w:after="120" w:before="0"/>
         <w:jc w:val="both"/>
       </w:pPr>
       <w:r>
@@ -5924,7 +5924,7 @@
     </w:p>
     <w:p>
       <w:pPr>
-        <w:spacing w:after="120" w:before="0" w:line="276" w:lineRule="auto"/>
+        <w:spacing w:after="120" w:before="0"/>
         <w:jc w:val="both"/>
       </w:pPr>
       <w:r>
@@ -5959,7 +5959,7 @@
     </w:p>
     <w:p>
       <w:pPr>
-        <w:spacing w:after="120" w:before="0" w:line="276" w:lineRule="auto"/>
+        <w:spacing w:after="120" w:before="0"/>
         <w:jc w:val="both"/>
       </w:pPr>
       <w:r>
@@ -5976,7 +5976,7 @@
     </w:p>
     <w:p>
       <w:pPr>
-        <w:spacing w:after="120" w:before="0" w:line="276" w:lineRule="auto"/>
+        <w:spacing w:after="120" w:before="0"/>
         <w:jc w:val="both"/>
       </w:pPr>
       <w:r>
@@ -5993,7 +5993,7 @@
     </w:p>
     <w:p>
       <w:pPr>
-        <w:spacing w:after="120" w:before="0" w:line="276" w:lineRule="auto"/>
+        <w:spacing w:after="120" w:before="0"/>
         <w:jc w:val="both"/>
       </w:pPr>
       <w:r>
@@ -6010,7 +6010,7 @@
     </w:p>
     <w:p>
       <w:pPr>
-        <w:spacing w:after="120" w:before="0" w:line="276" w:lineRule="auto"/>
+        <w:spacing w:after="120" w:before="0"/>
         <w:jc w:val="both"/>
       </w:pPr>
       <w:r>
@@ -6027,7 +6027,7 @@
     </w:p>
     <w:p>
       <w:pPr>
-        <w:spacing w:after="120" w:before="0" w:line="276" w:lineRule="auto"/>
+        <w:spacing w:after="120" w:before="0"/>
         <w:jc w:val="both"/>
       </w:pPr>
       <w:r>
@@ -6044,7 +6044,7 @@
     </w:p>
     <w:p>
       <w:pPr>
-        <w:spacing w:after="120" w:before="0" w:line="276" w:lineRule="auto"/>
+        <w:spacing w:after="120" w:before="0"/>
         <w:jc w:val="both"/>
       </w:pPr>
       <w:r>
@@ -6061,7 +6061,7 @@
     </w:p>
     <w:p>
       <w:pPr>
-        <w:spacing w:after="120" w:before="0" w:line="276" w:lineRule="auto"/>
+        <w:spacing w:after="120" w:before="0"/>
         <w:jc w:val="both"/>
       </w:pPr>
       <w:r>
@@ -6078,7 +6078,7 @@
     </w:p>
     <w:p>
       <w:pPr>
-        <w:spacing w:after="120" w:before="0" w:line="276" w:lineRule="auto"/>
+        <w:spacing w:after="120" w:before="0"/>
         <w:jc w:val="both"/>
       </w:pPr>
       <w:r>
@@ -6095,7 +6095,7 @@
     </w:p>
     <w:p>
       <w:pPr>
-        <w:spacing w:after="120" w:before="0" w:line="276" w:lineRule="auto"/>
+        <w:spacing w:after="120" w:before="0"/>
         <w:jc w:val="both"/>
       </w:pPr>
       <w:r>
@@ -6112,7 +6112,7 @@
     </w:p>
     <w:p>
       <w:pPr>
-        <w:spacing w:after="120" w:before="0" w:line="276" w:lineRule="auto"/>
+        <w:spacing w:after="120" w:before="0"/>
         <w:jc w:val="both"/>
       </w:pPr>
       <w:r>
@@ -6129,7 +6129,7 @@
     </w:p>
     <w:p>
       <w:pPr>
-        <w:spacing w:after="120" w:before="0" w:line="276" w:lineRule="auto"/>
+        <w:spacing w:after="120" w:before="0"/>
         <w:jc w:val="both"/>
       </w:pPr>
       <w:r>
@@ -6146,7 +6146,7 @@
     </w:p>
     <w:p>
       <w:pPr>
-        <w:spacing w:after="120" w:before="0" w:line="276" w:lineRule="auto"/>
+        <w:spacing w:after="120" w:before="0"/>
         <w:jc w:val="both"/>
       </w:pPr>
       <w:r>
@@ -6163,7 +6163,7 @@
     </w:p>
     <w:p>
       <w:pPr>
-        <w:spacing w:after="120" w:before="0" w:line="276" w:lineRule="auto"/>
+        <w:spacing w:after="120" w:before="0"/>
         <w:jc w:val="both"/>
       </w:pPr>
       <w:r>
@@ -6180,7 +6180,7 @@
     </w:p>
     <w:p>
       <w:pPr>
-        <w:spacing w:after="120" w:before="0" w:line="276" w:lineRule="auto"/>
+        <w:spacing w:after="120" w:before="0"/>
         <w:jc w:val="both"/>
       </w:pPr>
       <w:r>
@@ -6197,7 +6197,7 @@
     </w:p>
     <w:p>
       <w:pPr>
-        <w:spacing w:after="120" w:before="0" w:line="276" w:lineRule="auto"/>
+        <w:spacing w:after="120" w:before="0"/>
         <w:jc w:val="both"/>
       </w:pPr>
       <w:r>
@@ -6214,7 +6214,7 @@
     </w:p>
     <w:p>
       <w:pPr>
-        <w:spacing w:after="120" w:before="0" w:line="276" w:lineRule="auto"/>
+        <w:spacing w:after="120" w:before="0"/>
         <w:jc w:val="both"/>
       </w:pPr>
       <w:r>
@@ -6231,7 +6231,7 @@
     </w:p>
     <w:p>
       <w:pPr>
-        <w:spacing w:after="120" w:before="0" w:line="276" w:lineRule="auto"/>
+        <w:spacing w:after="120" w:before="0"/>
         <w:jc w:val="both"/>
       </w:pPr>
       <w:r>
@@ -6248,7 +6248,7 @@
     </w:p>
     <w:p>
       <w:pPr>
-        <w:spacing w:after="120" w:before="0" w:line="276" w:lineRule="auto"/>
+        <w:spacing w:after="120" w:before="0"/>
         <w:jc w:val="both"/>
       </w:pPr>
       <w:r>
@@ -6265,7 +6265,7 @@
     </w:p>
     <w:p>
       <w:pPr>
-        <w:spacing w:after="120" w:before="0" w:line="276" w:lineRule="auto"/>
+        <w:spacing w:after="120" w:before="0"/>
         <w:jc w:val="both"/>
       </w:pPr>
       <w:r>
@@ -6282,7 +6282,7 @@
     </w:p>
     <w:p>
       <w:pPr>
-        <w:spacing w:after="120" w:before="0" w:line="276" w:lineRule="auto"/>
+        <w:spacing w:after="120" w:before="0"/>
         <w:jc w:val="both"/>
       </w:pPr>
       <w:r>
@@ -6299,7 +6299,7 @@
     </w:p>
     <w:p>
       <w:pPr>
-        <w:spacing w:after="120" w:before="0" w:line="276" w:lineRule="auto"/>
+        <w:spacing w:after="120" w:before="0"/>
         <w:jc w:val="both"/>
       </w:pPr>
       <w:r>
@@ -6316,7 +6316,7 @@
     </w:p>
     <w:p>
       <w:pPr>
-        <w:spacing w:after="120" w:before="0" w:line="276" w:lineRule="auto"/>
+        <w:spacing w:after="120" w:before="0"/>
         <w:jc w:val="both"/>
       </w:pPr>
       <w:r>
@@ -6333,7 +6333,7 @@
     </w:p>
     <w:p>
       <w:pPr>
-        <w:spacing w:after="120" w:before="0" w:line="276" w:lineRule="auto"/>
+        <w:spacing w:after="120" w:before="0"/>
         <w:jc w:val="both"/>
       </w:pPr>
       <w:r>
@@ -6350,7 +6350,7 @@
     </w:p>
     <w:p>
       <w:pPr>
-        <w:spacing w:after="120" w:before="0" w:line="276" w:lineRule="auto"/>
+        <w:spacing w:after="120" w:before="0"/>
         <w:jc w:val="both"/>
       </w:pPr>
       <w:r>
@@ -6385,7 +6385,7 @@
     </w:p>
     <w:p>
       <w:pPr>
-        <w:spacing w:after="120" w:before="0" w:line="276" w:lineRule="auto"/>
+        <w:spacing w:after="120" w:before="0"/>
         <w:jc w:val="both"/>
       </w:pPr>
       <w:r>
@@ -6402,7 +6402,7 @@
     </w:p>
     <w:p>
       <w:pPr>
-        <w:spacing w:after="120" w:before="0" w:line="276" w:lineRule="auto"/>
+        <w:spacing w:after="120" w:before="0"/>
         <w:jc w:val="both"/>
       </w:pPr>
       <w:r>
@@ -6419,7 +6419,7 @@
     </w:p>
     <w:p>
       <w:pPr>
-        <w:spacing w:after="120" w:before="0" w:line="276" w:lineRule="auto"/>
+        <w:spacing w:after="120" w:before="0"/>
         <w:jc w:val="both"/>
       </w:pPr>
       <w:r>
@@ -6436,7 +6436,7 @@
     </w:p>
     <w:p>
       <w:pPr>
-        <w:spacing w:after="120" w:before="0" w:line="276" w:lineRule="auto"/>
+        <w:spacing w:after="120" w:before="0"/>
         <w:jc w:val="both"/>
       </w:pPr>
       <w:r>
@@ -6453,7 +6453,7 @@
     </w:p>
     <w:p>
       <w:pPr>
-        <w:spacing w:after="120" w:before="0" w:line="276" w:lineRule="auto"/>
+        <w:spacing w:after="120" w:before="0"/>
         <w:jc w:val="both"/>
       </w:pPr>
       <w:r>
@@ -6470,7 +6470,7 @@
     </w:p>
     <w:p>
       <w:pPr>
-        <w:spacing w:after="120" w:before="0" w:line="276" w:lineRule="auto"/>
+        <w:spacing w:after="120" w:before="0"/>
         <w:jc w:val="both"/>
       </w:pPr>
       <w:r>
@@ -6487,7 +6487,7 @@
     </w:p>
     <w:p>
       <w:pPr>
-        <w:spacing w:after="120" w:before="0" w:line="276" w:lineRule="auto"/>
+        <w:spacing w:after="120" w:before="0"/>
         <w:jc w:val="both"/>
       </w:pPr>
       <w:r>
@@ -6504,7 +6504,7 @@
     </w:p>
     <w:p>
       <w:pPr>
-        <w:spacing w:after="120" w:before="0" w:line="276" w:lineRule="auto"/>
+        <w:spacing w:after="120" w:before="0"/>
         <w:jc w:val="both"/>
       </w:pPr>
       <w:r>
@@ -6521,7 +6521,7 @@
     </w:p>
     <w:p>
       <w:pPr>
-        <w:spacing w:after="120" w:before="0" w:line="276" w:lineRule="auto"/>
+        <w:spacing w:after="120" w:before="0"/>
         <w:jc w:val="both"/>
       </w:pPr>
       <w:r>
@@ -6538,7 +6538,7 @@
     </w:p>
     <w:p>
       <w:pPr>
-        <w:spacing w:after="120" w:before="0" w:line="276" w:lineRule="auto"/>
+        <w:spacing w:after="120" w:before="0"/>
         <w:jc w:val="both"/>
       </w:pPr>
       <w:r>
@@ -6555,7 +6555,7 @@
     </w:p>
     <w:p>
       <w:pPr>
-        <w:spacing w:after="120" w:before="0" w:line="276" w:lineRule="auto"/>
+        <w:spacing w:after="120" w:before="0"/>
         <w:jc w:val="both"/>
       </w:pPr>
       <w:r>
@@ -6572,7 +6572,7 @@
     </w:p>
     <w:p>
       <w:pPr>
-        <w:spacing w:after="120" w:before="0" w:line="276" w:lineRule="auto"/>
+        <w:spacing w:after="120" w:before="0"/>
         <w:jc w:val="both"/>
       </w:pPr>
       <w:r>
@@ -6589,7 +6589,7 @@
     </w:p>
     <w:p>
       <w:pPr>
-        <w:spacing w:after="120" w:before="0" w:line="276" w:lineRule="auto"/>
+        <w:spacing w:after="120" w:before="0"/>
         <w:jc w:val="both"/>
       </w:pPr>
       <w:r>
@@ -6606,7 +6606,7 @@
     </w:p>
     <w:p>
       <w:pPr>
-        <w:spacing w:after="120" w:before="0" w:line="276" w:lineRule="auto"/>
+        <w:spacing w:after="120" w:before="0"/>
         <w:jc w:val="both"/>
       </w:pPr>
       <w:r>
@@ -6623,7 +6623,7 @@
     </w:p>
     <w:p>
       <w:pPr>
-        <w:spacing w:after="120" w:before="0" w:line="276" w:lineRule="auto"/>
+        <w:spacing w:after="120" w:before="0"/>
         <w:jc w:val="both"/>
       </w:pPr>
       <w:r>
@@ -6640,7 +6640,7 @@
     </w:p>
     <w:p>
       <w:pPr>
-        <w:spacing w:after="120" w:before="0" w:line="276" w:lineRule="auto"/>
+        <w:spacing w:after="120" w:before="0"/>
         <w:jc w:val="both"/>
       </w:pPr>
       <w:r>
@@ -6657,7 +6657,7 @@
     </w:p>
     <w:p>
       <w:pPr>
-        <w:spacing w:after="120" w:before="0" w:line="276" w:lineRule="auto"/>
+        <w:spacing w:after="120" w:before="0"/>
         <w:jc w:val="both"/>
       </w:pPr>
       <w:r>
@@ -6674,7 +6674,7 @@
     </w:p>
     <w:p>
       <w:pPr>
-        <w:spacing w:after="120" w:before="0" w:line="276" w:lineRule="auto"/>
+        <w:spacing w:after="120" w:before="0"/>
         <w:jc w:val="both"/>
       </w:pPr>
       <w:r>
@@ -6691,7 +6691,7 @@
     </w:p>
     <w:p>
       <w:pPr>
-        <w:spacing w:after="120" w:before="0" w:line="276" w:lineRule="auto"/>
+        <w:spacing w:after="120" w:before="0"/>
         <w:jc w:val="both"/>
       </w:pPr>
       <w:r>
@@ -6708,7 +6708,7 @@
     </w:p>
     <w:p>
       <w:pPr>
-        <w:spacing w:after="120" w:before="0" w:line="276" w:lineRule="auto"/>
+        <w:spacing w:after="120" w:before="0"/>
         <w:jc w:val="both"/>
       </w:pPr>
       <w:r>
@@ -6725,7 +6725,7 @@
     </w:p>
     <w:p>
       <w:pPr>
-        <w:spacing w:after="120" w:before="0" w:line="276" w:lineRule="auto"/>
+        <w:spacing w:after="120" w:before="0"/>
         <w:jc w:val="both"/>
       </w:pPr>
       <w:r>
@@ -6742,7 +6742,7 @@
     </w:p>
     <w:p>
       <w:pPr>
-        <w:spacing w:after="120" w:before="0" w:line="276" w:lineRule="auto"/>
+        <w:spacing w:after="120" w:before="0"/>
         <w:jc w:val="both"/>
       </w:pPr>
       <w:r>
@@ -6759,7 +6759,7 @@
     </w:p>
     <w:p>
       <w:pPr>
-        <w:spacing w:after="120" w:before="0" w:line="276" w:lineRule="auto"/>
+        <w:spacing w:after="120" w:before="0"/>
         <w:jc w:val="both"/>
       </w:pPr>
       <w:r>
@@ -6776,7 +6776,7 @@
     </w:p>
     <w:p>
       <w:pPr>
-        <w:spacing w:after="120" w:before="0" w:line="276" w:lineRule="auto"/>
+        <w:spacing w:after="120" w:before="0"/>
         <w:jc w:val="both"/>
       </w:pPr>
       <w:r>
@@ -6793,7 +6793,7 @@
     </w:p>
     <w:p>
       <w:pPr>
-        <w:spacing w:after="120" w:before="0" w:line="276" w:lineRule="auto"/>
+        <w:spacing w:after="120" w:before="0"/>
         <w:jc w:val="both"/>
       </w:pPr>
       <w:r>
@@ -6828,7 +6828,7 @@
     </w:p>
     <w:p>
       <w:pPr>
-        <w:spacing w:after="120" w:before="0" w:line="276" w:lineRule="auto"/>
+        <w:spacing w:after="120" w:before="0"/>
         <w:jc w:val="both"/>
       </w:pPr>
       <w:r>
@@ -6845,7 +6845,7 @@
     </w:p>
     <w:p>
       <w:pPr>
-        <w:spacing w:after="120" w:before="0" w:line="276" w:lineRule="auto"/>
+        <w:spacing w:after="120" w:before="0"/>
         <w:jc w:val="both"/>
       </w:pPr>
       <w:r>
@@ -6862,7 +6862,7 @@
     </w:p>
     <w:p>
       <w:pPr>
-        <w:spacing w:after="120" w:before="0" w:line="276" w:lineRule="auto"/>
+        <w:spacing w:after="120" w:before="0"/>
         <w:jc w:val="both"/>
       </w:pPr>
       <w:r>
@@ -6879,7 +6879,7 @@
     </w:p>
     <w:p>
       <w:pPr>
-        <w:spacing w:after="120" w:before="0" w:line="276" w:lineRule="auto"/>
+        <w:spacing w:after="120" w:before="0"/>
         <w:jc w:val="both"/>
       </w:pPr>
       <w:r>
@@ -6896,7 +6896,7 @@
     </w:p>
     <w:p>
       <w:pPr>
-        <w:spacing w:after="120" w:before="0" w:line="276" w:lineRule="auto"/>
+        <w:spacing w:after="120" w:before="0"/>
         <w:jc w:val="both"/>
       </w:pPr>
       <w:r>
@@ -6913,7 +6913,7 @@
     </w:p>
     <w:p>
       <w:pPr>
-        <w:spacing w:after="120" w:before="0" w:line="276" w:lineRule="auto"/>
+        <w:spacing w:after="120" w:before="0"/>
         <w:jc w:val="both"/>
       </w:pPr>
       <w:r>
@@ -6930,7 +6930,7 @@
     </w:p>
     <w:p>
       <w:pPr>
-        <w:spacing w:after="120" w:before="0" w:line="276" w:lineRule="auto"/>
+        <w:spacing w:after="120" w:before="0"/>
         <w:jc w:val="both"/>
       </w:pPr>
       <w:r>
@@ -6947,7 +6947,7 @@
     </w:p>
     <w:p>
       <w:pPr>
-        <w:spacing w:after="120" w:before="0" w:line="276" w:lineRule="auto"/>
+        <w:spacing w:after="120" w:before="0"/>
         <w:jc w:val="both"/>
       </w:pPr>
       <w:r>
@@ -6964,7 +6964,7 @@
     </w:p>
     <w:p>
       <w:pPr>
-        <w:spacing w:after="120" w:before="0" w:line="276" w:lineRule="auto"/>
+        <w:spacing w:after="120" w:before="0"/>
         <w:jc w:val="both"/>
       </w:pPr>
       <w:r>
@@ -6981,7 +6981,7 @@
     </w:p>
     <w:p>
       <w:pPr>
-        <w:spacing w:after="120" w:before="0" w:line="276" w:lineRule="auto"/>
+        <w:spacing w:after="120" w:before="0"/>
         <w:jc w:val="both"/>
       </w:pPr>
       <w:r>
@@ -6998,7 +6998,7 @@
     </w:p>
     <w:p>
       <w:pPr>
-        <w:spacing w:after="120" w:before="0" w:line="276" w:lineRule="auto"/>
+        <w:spacing w:after="120" w:before="0"/>
         <w:jc w:val="both"/>
       </w:pPr>
       <w:r>
@@ -7015,7 +7015,7 @@
     </w:p>
     <w:p>
       <w:pPr>
-        <w:spacing w:after="120" w:before="0" w:line="276" w:lineRule="auto"/>
+        <w:spacing w:after="120" w:before="0"/>
         <w:jc w:val="both"/>
       </w:pPr>
       <w:r>
@@ -7032,7 +7032,7 @@
     </w:p>
     <w:p>
       <w:pPr>
-        <w:spacing w:after="120" w:before="0" w:line="276" w:lineRule="auto"/>
+        <w:spacing w:after="120" w:before="0"/>
         <w:jc w:val="both"/>
       </w:pPr>
       <w:r>
@@ -7049,7 +7049,7 @@
     </w:p>
     <w:p>
       <w:pPr>
-        <w:spacing w:after="120" w:before="0" w:line="276" w:lineRule="auto"/>
+        <w:spacing w:after="120" w:before="0"/>
         <w:jc w:val="both"/>
       </w:pPr>
       <w:r>
@@ -7066,7 +7066,7 @@
     </w:p>
     <w:p>
       <w:pPr>
-        <w:spacing w:after="120" w:before="0" w:line="276" w:lineRule="auto"/>
+        <w:spacing w:after="120" w:before="0"/>
         <w:jc w:val="both"/>
       </w:pPr>
       <w:r>
@@ -7083,7 +7083,7 @@
     </w:p>
     <w:p>
       <w:pPr>
-        <w:spacing w:after="120" w:before="0" w:line="276" w:lineRule="auto"/>
+        <w:spacing w:after="120" w:before="0"/>
         <w:jc w:val="both"/>
       </w:pPr>
       <w:r>
@@ -7100,7 +7100,7 @@
     </w:p>
     <w:p>
       <w:pPr>
-        <w:spacing w:after="120" w:before="0" w:line="276" w:lineRule="auto"/>
+        <w:spacing w:after="120" w:before="0"/>
         <w:jc w:val="both"/>
       </w:pPr>
       <w:r>
@@ -7117,7 +7117,7 @@
     </w:p>
     <w:p>
       <w:pPr>
-        <w:spacing w:after="120" w:before="0" w:line="276" w:lineRule="auto"/>
+        <w:spacing w:after="120" w:before="0"/>
         <w:jc w:val="both"/>
       </w:pPr>
       <w:r>
@@ -7134,7 +7134,7 @@
     </w:p>
     <w:p>
       <w:pPr>
-        <w:spacing w:after="120" w:before="0" w:line="276" w:lineRule="auto"/>
+        <w:spacing w:after="120" w:before="0"/>
         <w:jc w:val="both"/>
       </w:pPr>
       <w:r>
@@ -7169,7 +7169,7 @@
     </w:p>
     <w:p>
       <w:pPr>
-        <w:spacing w:after="120" w:before="0" w:line="276" w:lineRule="auto"/>
+        <w:spacing w:after="120" w:before="0"/>
         <w:jc w:val="both"/>
       </w:pPr>
       <w:r>
@@ -7186,7 +7186,7 @@
     </w:p>
     <w:p>
       <w:pPr>
-        <w:spacing w:after="120" w:before="0" w:line="276" w:lineRule="auto"/>
+        <w:spacing w:after="120" w:before="0"/>
         <w:jc w:val="both"/>
       </w:pPr>
       <w:r>
@@ -7221,7 +7221,7 @@
     </w:p>
     <w:p>
       <w:pPr>
-        <w:spacing w:after="120" w:before="0" w:line="276" w:lineRule="auto"/>
+        <w:spacing w:after="120" w:before="0"/>
         <w:jc w:val="both"/>
       </w:pPr>
       <w:r>
@@ -7238,7 +7238,7 @@
     </w:p>
     <w:p>
       <w:pPr>
-        <w:spacing w:after="120" w:before="0" w:line="276" w:lineRule="auto"/>
+        <w:spacing w:after="120" w:before="0"/>
         <w:jc w:val="both"/>
       </w:pPr>
       <w:r>
@@ -7313,7 +7313,7 @@
     </w:tbl>
     <w:p>
       <w:pPr>
-        <w:spacing w:after="120" w:before="0" w:line="276" w:lineRule="auto"/>
+        <w:spacing w:after="120" w:before="0"/>
         <w:jc w:val="both"/>
       </w:pPr>
       <w:r>
@@ -7348,7 +7348,7 @@
     </w:p>
     <w:p>
       <w:pPr>
-        <w:spacing w:after="120" w:before="0" w:line="276" w:lineRule="auto"/>
+        <w:spacing w:after="120" w:before="0"/>
         <w:jc w:val="both"/>
       </w:pPr>
       <w:r>
@@ -7365,7 +7365,7 @@
     </w:p>
     <w:p>
       <w:pPr>
-        <w:spacing w:after="120" w:before="0" w:line="276" w:lineRule="auto"/>
+        <w:spacing w:after="120" w:before="0"/>
         <w:jc w:val="both"/>
       </w:pPr>
       <w:r>
@@ -7382,7 +7382,7 @@
     </w:p>
     <w:p>
       <w:pPr>
-        <w:spacing w:after="120" w:before="0" w:line="276" w:lineRule="auto"/>
+        <w:spacing w:after="120" w:before="0"/>
         <w:jc w:val="both"/>
       </w:pPr>
       <w:r>
@@ -7417,7 +7417,7 @@
     </w:p>
     <w:p>
       <w:pPr>
-        <w:spacing w:after="120" w:before="0" w:line="276" w:lineRule="auto"/>
+        <w:spacing w:after="120" w:before="0"/>
         <w:jc w:val="both"/>
       </w:pPr>
       <w:r>
@@ -7434,7 +7434,7 @@
     </w:p>
     <w:p>
       <w:pPr>
-        <w:spacing w:after="120" w:before="0" w:line="276" w:lineRule="auto"/>
+        <w:spacing w:after="120" w:before="0"/>
         <w:jc w:val="both"/>
       </w:pPr>
       <w:r>
@@ -7451,7 +7451,7 @@
     </w:p>
     <w:p>
       <w:pPr>
-        <w:spacing w:after="120" w:before="0" w:line="276" w:lineRule="auto"/>
+        <w:spacing w:after="120" w:before="0"/>
         <w:jc w:val="both"/>
       </w:pPr>
       <w:r>
@@ -7468,7 +7468,7 @@
     </w:p>
     <w:p>
       <w:pPr>
-        <w:spacing w:after="120" w:before="0" w:line="276" w:lineRule="auto"/>
+        <w:spacing w:after="120" w:before="0"/>
         <w:jc w:val="both"/>
       </w:pPr>
       <w:r>
@@ -7485,7 +7485,7 @@
     </w:p>
     <w:p>
       <w:pPr>
-        <w:spacing w:after="120" w:before="0" w:line="276" w:lineRule="auto"/>
+        <w:spacing w:after="120" w:before="0"/>
         <w:jc w:val="both"/>
       </w:pPr>
       <w:r>

</xml_diff>

<commit_message>
Buch 4: Notfall-Text am Buchende ergänzen (vor Impressum)
</commit_message>
<xml_diff>
--- a/outputs/buch-schuldgefuehle/das-schlechte-gewissen-Taschenbuch.docx
+++ b/outputs/buch-schuldgefuehle/das-schlechte-gewissen-Taschenbuch.docx
@@ -7940,6 +7940,62 @@
           <w:sz w:val="22"/>
         </w:rPr>
         <w:t>info.safetothrive@gmail.com</w:t>
+      </w:r>
+    </w:p>
+    <w:p/>
+    <w:p>
+      <w:r>
+        <w:rPr>
+          <w:rFonts w:ascii="Georgia" w:hAnsi="Georgia"/>
+          <w:b w:val="0"/>
+          <w:i w:val="0"/>
+          <w:sz w:val="34"/>
+        </w:rPr>
+        <w:t>Und wenn es mehr ist als ein schlechter Tag</w:t>
+      </w:r>
+    </w:p>
+    <w:p>
+      <w:r>
+        <w:rPr>
+          <w:rFonts w:ascii="Georgia" w:hAnsi="Georgia"/>
+          <w:b w:val="0"/>
+          <w:i w:val="0"/>
+          <w:sz w:val="22"/>
+        </w:rPr>
+        <w:t>Wenn du seit Wochen nicht mehr herauskommst. Wenn du nachts wach liegst und denkst, dass es ohne dich leichter wäre.</w:t>
+      </w:r>
+    </w:p>
+    <w:p>
+      <w:r>
+        <w:rPr>
+          <w:rFonts w:ascii="Georgia" w:hAnsi="Georgia"/>
+          <w:b w:val="0"/>
+          <w:i w:val="0"/>
+          <w:sz w:val="22"/>
+        </w:rPr>
+        <w:t>Dann ist dieses Buch nicht genug. Das ist keine Schwäche, das ist einfach so.</w:t>
+      </w:r>
+    </w:p>
+    <w:p>
+      <w:r>
+        <w:rPr>
+          <w:rFonts w:ascii="Georgia" w:hAnsi="Georgia"/>
+          <w:b w:val="0"/>
+          <w:i w:val="0"/>
+          <w:sz w:val="22"/>
+        </w:rPr>
+        <w:t>Ruf an. Kostenlos, anonym, Tag und Nacht besetzt.</w:t>
+      </w:r>
+    </w:p>
+    <w:p>
+      <w:r>
+        <w:rPr>
+          <w:rFonts w:ascii="Georgia" w:hAnsi="Georgia"/>
+          <w:b w:val="0"/>
+          <w:i w:val="0"/>
+          <w:sz w:val="22"/>
+        </w:rPr>
+        <w:t>Schweiz 143 · Deutschland 0800 111 0 111 · Österreich 142</w:t>
       </w:r>
     </w:p>
     <w:p/>

</xml_diff>

<commit_message>
Journal-Hinweis im Hauptbuch ergänzen, Taschenbuch-PDF und eBook neu bauen
Nebenbei behoben: eBook war zuvor aus einer veralteten Manuskript-Datei
gebaut, die 'Petra Tanner ist Therapeutin und Coachin' sowie den kompletten
Pflichtteil-Abschnitt hinten vermissen liess. Jetzt aus der geprüften
Taschenbuch.docx gebaut, Rechtssicherheits-Check ist grün.
</commit_message>
<xml_diff>
--- a/outputs/buch-schuldgefuehle/das-schlechte-gewissen-Taschenbuch.docx
+++ b/outputs/buch-schuldgefuehle/das-schlechte-gewissen-Taschenbuch.docx
@@ -7746,6 +7746,23 @@
           <w:szCs w:val="220"/>
         </w:rPr>
         <w:t>info.safetothrive@gmail.com</w:t>
+      </w:r>
+    </w:p>
+    <w:p>
+      <w:pPr>
+        <w:spacing w:after="120" w:before="0"/>
+        <w:jc w:val="both"/>
+      </w:pPr>
+      <w:r>
+        <w:rPr>
+          <w:rFonts w:ascii="Georgia" w:cs="Georgia" w:eastAsia="Georgia" w:hAnsi="Georgia"/>
+          <w:b w:val="false"/>
+          <w:bCs w:val="false"/>
+          <w:color w:val="2C2C2C"/>
+          <w:sz w:val="220"/>
+          <w:szCs w:val="220"/>
+        </w:rPr>
+        <w:t>Zu diesem Buch gibt es auch ein Journal: „Das schlechte Gewissen – Das Journal“, mit Reflexionsfragen und Schreibraum zu jedem Kapitel. Erhältlich ebenfalls bei Amazon.</w:t>
       </w:r>
     </w:p>
     <w:p/>

</xml_diff>

<commit_message>
Das schlechte Gewissen: absolute Aussagen zu Nervensystem/Cortisol vorsichtiger formuliert, Wiederholungen gekuerzt
</commit_message>
<xml_diff>
--- a/outputs/buch-schuldgefuehle/das-schlechte-gewissen-Taschenbuch.docx
+++ b/outputs/buch-schuldgefuehle/das-schlechte-gewissen-Taschenbuch.docx
@@ -1526,7 +1526,7 @@
           <w:sz w:val="220"/>
           <w:szCs w:val="220"/>
         </w:rPr>
-        <w:t xml:space="preserve">Das Nervensystem unterscheidet nicht zwischen einer konkreten äusseren Bedrohung und einem diffusen inneren Vorwurf. Es reagiert auf beides mit Anspannung, mit Cortisol, mit einem Körper, der bereit ist, auf eine Gefahr zu reagieren, die er nicht greifen kann. Wenn dieser Zustand zum Dauerzustand wird, zahlt der Körper einen Preis. Schlafprobleme. Erschöpfung, die durch Schlaf allein nicht behoben wird, weil sie nicht aus körperlicher Arbeit stammt. Verspannungen, Kopfschmerzen, Verdauungsprobleme, ein Immunsystem, das anfälliger wird. Dazu kommen wir in Kapitel 8 noch genauer.</w:t>
+        <w:t>Das Nervensystem unterscheidet nicht klar zwischen einer konkreten äusseren Bedrohung und einem diffusen inneren Vorwurf. Es kann auf beides ähnlich reagieren, mit Anspannung, mit einem Körper, der bereit ist, auf eine Gefahr zu reagieren, die er nicht greifen kann. Wird dieser Zustand zum Dauerzustand, kann das dem Körper auf Dauer zusetzen. Mehr dazu in Kapitel 8.</w:t>
       </w:r>
     </w:p>
     <w:p>
@@ -1901,7 +1901,7 @@
           <w:sz w:val="220"/>
           <w:szCs w:val="220"/>
         </w:rPr>
-        <w:t xml:space="preserve">Kinder brauchen Liebe und Zugehörigkeit wie Essen und Schlaf. Das ist keine Metapher, das ist Biologie. Ein kleines Kind, das ohne emotionale Verbindung und Zugehörigkeit aufwächst, überlebt buchstäblich nicht. Das Nervensystem des Kindes ist evolutionär darauf ausgerichtet, die Signale der Bezugspersonen zu lesen: Bin ich sicher? Werde ich geliebt? Gehöre ich dazu? Diese Fragen werden nicht rational gestellt. Sie werden vom Nervensystem permanent und automatisch verarbeitet, laufend, wie ein System, das nie in den Standby-Modus wechselt.</w:t>
+        <w:t>Kinder brauchen Liebe und Zugehörigkeit dringend, wie Essen und Schlaf. Ein kleines Kind, das über lange Zeit ohne emotionale Verbindung aufwächst, ist in seiner Entwicklung ernsthaft gefährdet. Vieles deutet darauf hin, dass ein Kind früh lernt, die Signale seiner Bezugspersonen zu lesen: Bin ich sicher? Werde ich geliebt? Gehöre ich dazu? Diese Fragen werden nicht bewusst gestellt. Sie prägen sich früh und tief ein, oft ohne dass wir uns später bewusst daran erinnern können.</w:t>
       </w:r>
     </w:p>
     <w:p>
@@ -4464,7 +4464,7 @@
           <w:sz w:val="220"/>
           <w:szCs w:val="220"/>
         </w:rPr>
-        <w:t xml:space="preserve">Chronisches Schuldgefühl ist kein rein emotionales Phänomen. Es ist ein körperlicher Zustand. Das Stresssystem wird aktiviert: Cortisol und Adrenalin werden ausgeschüttet. Das System, das für die Aktivierung bei Bedrohung zuständig ist, bleibt aktiv. Das System der Ruhe, der Erholung, des tiefen Schlafs kommt nicht ausreichend zum Zug.</w:t>
+        <w:t>Chronisches Schuldgefühl ist kein rein emotionales Phänomen. Es kann sich auch körperlich bemerkbar machen: Das Stresssystem wird aktiviert, der Körper bleibt angespannt, als müsste er auf eine Bedrohung reagieren. Ruhe und tiefe Erholung kommen dann oft zu kurz.</w:t>
       </w:r>
     </w:p>
     <w:p>
@@ -4498,7 +4498,7 @@
           <w:sz w:val="220"/>
           <w:szCs w:val="220"/>
         </w:rPr>
-        <w:t xml:space="preserve">Das hat Konsequenzen, die sich manchmal erst nach Jahren zeigen. Schlafprobleme, weil das Nervensystem nachts nicht in den Ruhemodus wechseln kann. Es wacht weiter, denkt weiter, bewertet weiter. Chronische Verspannungen, weil die Muskulatur dauerhaft angespannt ist. Eine Erschöpfung, die durch Schlaf allein nicht behoben wird, weil sie nicht aus körperlicher Arbeit stammt, sondern aus der permanenten Stressaktivierung. Kopfschmerzen. Verdauungsprobleme. Ein Immunsystem, das anfälliger wird.</w:t>
+        <w:t>Das kann sich manchmal erst nach Jahren zeigen: Schlafprobleme, weil der Kopf nachts nicht abschaltet. Verspannungen. Eine Erschöpfung, die durch Schlaf allein nicht behoben wird. Nicht bei jedem gleich stark, aber ein Muster, das viele Frauen mit chronischem Schuldgefühl wiedererkennen.</w:t>
       </w:r>
     </w:p>
     <w:p>

</xml_diff>